<commit_message>
Preparar Anexo de Oraciones (borradores [PROPUESTA]) + prompt del logo del pez ICTUS
- ANEXO_ORACIONES_88.md: oraciones preparadas como borrador. Textos
  compuestos marcados [PROPUESTA] para confirmar con Padre Paul + Sor +
  Música; oraciones de la Iglesia (Ave María, bendición de mesa) sin marca.
  Secciones: equipo mañana/noche, María, Bayuyo (Mt 5,13-16 + rito), mesa,
  ante el Santísimo, otros momentos.
- preparacion/PROMPT_LOGO_PEZ.md: prompt + pasos para generar en Claude el
  logo del pez ICTUS de colores y reemplazar el placeholder del repo.
- Regenerado el pipeline: las oraciones fluyen a entrega_diseno/ANEXO_4 y a
  la Carpeta booklet (.docx). verify.py 9/9 TODO PASS.

https://claude.ai/code/session_016scja59CycFFrqKgYsUPWh
</commit_message>
<xml_diff>
--- a/entrega_diseno/CARPETA_ETC88.docx
+++ b/entrega_diseno/CARPETA_ETC88.docx
@@ -16260,19 +16260,11 @@
             <w:r>
               <w:rPr>
                 <w:rFonts w:ascii="Calibri" w:hAnsi="Calibri"/>
-                <w:color w:val="1B3A5C"/>
-                <w:sz w:val="21"/>
-              </w:rPr>
-              <w:t xml:space="preserve">Reúne los momentos de oración del ETC: cuándo, quién los lleva, su base bíblica y los materiales. Los textos marcados </w:t>
-            </w:r>
-            <w:r>
-              <w:rPr>
-                <w:rFonts w:ascii="Calibri" w:hAnsi="Calibri"/>
                 <w:b/>
                 <w:color w:val="1B3A5C"/>
                 <w:sz w:val="21"/>
               </w:rPr>
-              <w:t>[DEL CANCIONERO]</w:t>
+              <w:t>Borrador de oraciones.</w:t>
             </w:r>
             <w:r>
               <w:rPr>
@@ -16280,7 +16272,7 @@
                 <w:color w:val="1B3A5C"/>
                 <w:sz w:val="21"/>
               </w:rPr>
-              <w:t xml:space="preserve"> los trae Música; los marcados </w:t>
+              <w:t xml:space="preserve"> Los textos compuestos van marcados </w:t>
             </w:r>
             <w:r>
               <w:rPr>
@@ -16289,7 +16281,7 @@
                 <w:color w:val="1B3A5C"/>
                 <w:sz w:val="21"/>
               </w:rPr>
-              <w:t>[POR DEFINIR]</w:t>
+              <w:t>[PROPUESTA]</w:t>
             </w:r>
             <w:r>
               <w:rPr>
@@ -16297,7 +16289,24 @@
                 <w:color w:val="1B3A5C"/>
                 <w:sz w:val="21"/>
               </w:rPr>
-              <w:t xml:space="preserve"> se cierran con el Padre Paul.</w:t>
+              <w:t xml:space="preserve"> — se confirman o se reemplazan con </w:t>
+            </w:r>
+            <w:r>
+              <w:rPr>
+                <w:rFonts w:ascii="Calibri" w:hAnsi="Calibri"/>
+                <w:b/>
+                <w:color w:val="1B3A5C"/>
+                <w:sz w:val="21"/>
+              </w:rPr>
+              <w:t>Padre Paul + Sor Angelina</w:t>
+            </w:r>
+            <w:r>
+              <w:rPr>
+                <w:rFonts w:ascii="Calibri" w:hAnsi="Calibri"/>
+                <w:color w:val="1B3A5C"/>
+                <w:sz w:val="21"/>
+              </w:rPr>
+              <w:t xml:space="preserve"> (y Música para los cantos/Bayuyo). Las oraciones de la Iglesia (Ave María, bendición de la mesa) van sin marca.</w:t>
             </w:r>
           </w:p>
         </w:tc>
@@ -16323,7 +16332,7 @@
           <w:color w:val="1B3A5C"/>
           <w:sz w:val="40"/>
         </w:rPr>
-        <w:t>1. Oración del equipo (mañana y noche)</w:t>
+        <w:t>1. Oración del equipo — mañana</w:t>
       </w:r>
     </w:p>
     <w:p>
@@ -16346,14 +16355,8 @@
           <w:color w:val="1A1A1A"/>
           <w:sz w:val="22"/>
         </w:rPr>
-        <w:t xml:space="preserve"> al despertar y antes de dormir, cada día (solo el equipo).</w:t>
-      </w:r>
-    </w:p>
-    <w:p>
-      <w:pPr>
-        <w:pStyle w:val="ListBullet"/>
-        <w:spacing w:after="20"/>
-      </w:pPr>
+        <w:t xml:space="preserve"> al despertar, cada día (solo el equipo). </w:t>
+      </w:r>
       <w:r>
         <w:rPr>
           <w:rFonts w:ascii="Calibri" w:hAnsi="Calibri"/>
@@ -16369,132 +16372,7 @@
           <w:color w:val="1A1A1A"/>
           <w:sz w:val="22"/>
         </w:rPr>
-        <w:t xml:space="preserve"> un asesor o un guía designado.</w:t>
-      </w:r>
-    </w:p>
-    <w:p>
-      <w:pPr>
-        <w:pStyle w:val="ListBullet"/>
-        <w:spacing w:after="20"/>
-      </w:pPr>
-      <w:r>
-        <w:rPr>
-          <w:rFonts w:ascii="Calibri" w:hAnsi="Calibri"/>
-          <w:b/>
-          <w:color w:val="1A1A1A"/>
-          <w:sz w:val="22"/>
-        </w:rPr>
-        <w:t>Forma:</w:t>
-      </w:r>
-      <w:r>
-        <w:rPr>
-          <w:rFonts w:ascii="Calibri" w:hAnsi="Calibri"/>
-          <w:color w:val="1A1A1A"/>
-          <w:sz w:val="22"/>
-        </w:rPr>
-        <w:t xml:space="preserve"> dirigida o espontánea; centra al equipo en el servicio y en el participante. Sin texto fijo.</w:t>
-      </w:r>
-    </w:p>
-    <w:p>
-      <w:pPr>
-        <w:keepNext/>
-        <w:spacing w:before="80" w:after="160"/>
-        <w:pBdr>
-          <w:bottom w:val="single" w:sz="12" w:space="4" w:color="E36C4F"/>
-        </w:pBdr>
-      </w:pPr>
-      <w:r>
-        <w:rPr>
-          <w:rFonts w:ascii="Calibri" w:hAnsi="Calibri"/>
-          <w:b/>
-          <w:color w:val="1B3A5C"/>
-          <w:sz w:val="40"/>
-        </w:rPr>
-        <w:t>2. Oración de los participantes a María (sábado AM)</w:t>
-      </w:r>
-    </w:p>
-    <w:p>
-      <w:pPr>
-        <w:pStyle w:val="ListBullet"/>
-        <w:spacing w:after="20"/>
-      </w:pPr>
-      <w:r>
-        <w:rPr>
-          <w:rFonts w:ascii="Calibri" w:hAnsi="Calibri"/>
-          <w:b/>
-          <w:color w:val="1A1A1A"/>
-          <w:sz w:val="22"/>
-        </w:rPr>
-        <w:t>Cuándo:</w:t>
-      </w:r>
-      <w:r>
-        <w:rPr>
-          <w:rFonts w:ascii="Calibri" w:hAnsi="Calibri"/>
-          <w:color w:val="1A1A1A"/>
-          <w:sz w:val="22"/>
-        </w:rPr>
-        <w:t xml:space="preserve"> sábado en la mañana, en la capilla.</w:t>
-      </w:r>
-    </w:p>
-    <w:p>
-      <w:pPr>
-        <w:pStyle w:val="ListBullet"/>
-        <w:spacing w:after="20"/>
-      </w:pPr>
-      <w:r>
-        <w:rPr>
-          <w:rFonts w:ascii="Calibri" w:hAnsi="Calibri"/>
-          <w:b/>
-          <w:color w:val="1A1A1A"/>
-          <w:sz w:val="22"/>
-        </w:rPr>
-        <w:t>Quién:</w:t>
-      </w:r>
-      <w:r>
-        <w:rPr>
-          <w:rFonts w:ascii="Calibri" w:hAnsi="Calibri"/>
-          <w:color w:val="1A1A1A"/>
-          <w:sz w:val="22"/>
-        </w:rPr>
-        <w:t xml:space="preserve"> los guías designados + Música (cantos marianos).</w:t>
-      </w:r>
-    </w:p>
-    <w:p>
-      <w:pPr>
-        <w:pStyle w:val="ListBullet"/>
-        <w:spacing w:after="20"/>
-      </w:pPr>
-      <w:r>
-        <w:rPr>
-          <w:rFonts w:ascii="Calibri" w:hAnsi="Calibri"/>
-          <w:b/>
-          <w:color w:val="1A1A1A"/>
-          <w:sz w:val="22"/>
-        </w:rPr>
-        <w:t>Base:</w:t>
-      </w:r>
-      <w:r>
-        <w:rPr>
-          <w:rFonts w:ascii="Calibri" w:hAnsi="Calibri"/>
-          <w:color w:val="1A1A1A"/>
-          <w:sz w:val="22"/>
-        </w:rPr>
-        <w:t xml:space="preserve"> el Rosario o una oración inspirada en María.</w:t>
-      </w:r>
-    </w:p>
-    <w:p>
-      <w:pPr>
-        <w:pStyle w:val="ListBullet"/>
-        <w:spacing w:after="20"/>
-      </w:pPr>
-      <w:r>
-        <w:rPr>
-          <w:rFonts w:ascii="Calibri" w:hAnsi="Calibri"/>
-          <w:b/>
-          <w:color w:val="1A1A1A"/>
-          <w:sz w:val="22"/>
-        </w:rPr>
-        <w:t>Texto base — Ave María:</w:t>
+        <w:t xml:space="preserve"> un asesor o guía designado.</w:t>
       </w:r>
     </w:p>
     <w:tbl>
@@ -16526,10 +16404,43 @@
             <w:r>
               <w:rPr>
                 <w:rFonts w:ascii="Calibri" w:hAnsi="Calibri"/>
+                <w:b/>
                 <w:color w:val="1B3A5C"/>
                 <w:sz w:val="21"/>
               </w:rPr>
-              <w:t>Dios te salve, María, llena eres de gracia, el Señor es contigo. Bendita tú eres entre todas las mujeres, y bendito es el fruto de tu vientre, Jesús. Santa María, Madre de Dios, ruega por nosotros, pecadores, ahora y en la hora de nuestra muerte. Amén.</w:t>
+              <w:t>[PROPUESTA]</w:t>
+            </w:r>
+          </w:p>
+          <w:p>
+            <w:pPr>
+              <w:spacing w:after="20"/>
+            </w:pPr>
+            <w:r>
+              <w:rPr>
+                <w:rFonts w:ascii="Calibri" w:hAnsi="Calibri"/>
+                <w:i/>
+                <w:color w:val="1B3A5C"/>
+                <w:sz w:val="21"/>
+              </w:rPr>
+              <w:t xml:space="preserve">Señor Jesús, gracias por este nuevo día para servirte. Que hoy todos nuestros pensamientos, palabras y obras sean para Ti. Haznos instrumentos de tu gracia: que cada participante te encuentre a través de nosotros, y danos un corazón que se ponga de último. Que nada nos separe de Ti ni del equipo. </w:t>
+            </w:r>
+            <w:r>
+              <w:rPr>
+                <w:rFonts w:ascii="Calibri" w:hAnsi="Calibri"/>
+                <w:i/>
+                <w:color w:val="1B3A5C"/>
+                <w:sz w:val="21"/>
+              </w:rPr>
+              <w:t>Siempre amigos.</w:t>
+            </w:r>
+            <w:r>
+              <w:rPr>
+                <w:rFonts w:ascii="Calibri" w:hAnsi="Calibri"/>
+                <w:i/>
+                <w:color w:val="1B3A5C"/>
+                <w:sz w:val="21"/>
+              </w:rPr>
+              <w:t xml:space="preserve"> Amén.</w:t>
             </w:r>
           </w:p>
         </w:tc>
@@ -16555,7 +16466,7 @@
           <w:color w:val="1B3A5C"/>
           <w:sz w:val="40"/>
         </w:rPr>
-        <w:t>3. Oración "Sal y Luz del Mundo" — el Bayuyo (viernes noche)</w:t>
+        <w:t>2. Oración del equipo — noche</w:t>
       </w:r>
     </w:p>
     <w:p>
@@ -16578,14 +16489,8 @@
           <w:color w:val="1A1A1A"/>
           <w:sz w:val="22"/>
         </w:rPr>
-        <w:t xml:space="preserve"> viernes en la noche, en el patio.</w:t>
-      </w:r>
-    </w:p>
-    <w:p>
-      <w:pPr>
-        <w:pStyle w:val="ListBullet"/>
-        <w:spacing w:after="20"/>
-      </w:pPr>
+        <w:t xml:space="preserve"> antes de dormir (solo el equipo). </w:t>
+      </w:r>
       <w:r>
         <w:rPr>
           <w:rFonts w:ascii="Calibri" w:hAnsi="Calibri"/>
@@ -16601,238 +16506,7 @@
           <w:color w:val="1A1A1A"/>
           <w:sz w:val="22"/>
         </w:rPr>
-        <w:t xml:space="preserve"> Música la conduce.</w:t>
-      </w:r>
-    </w:p>
-    <w:p>
-      <w:pPr>
-        <w:pStyle w:val="ListBullet"/>
-        <w:spacing w:after="20"/>
-      </w:pPr>
-      <w:r>
-        <w:rPr>
-          <w:rFonts w:ascii="Calibri" w:hAnsi="Calibri"/>
-          <w:b/>
-          <w:color w:val="1A1A1A"/>
-          <w:sz w:val="22"/>
-        </w:rPr>
-        <w:t>Base bíblica:</w:t>
-      </w:r>
-      <w:r>
-        <w:rPr>
-          <w:rFonts w:ascii="Calibri" w:hAnsi="Calibri"/>
-          <w:color w:val="1A1A1A"/>
-          <w:sz w:val="22"/>
-        </w:rPr>
-        <w:t xml:space="preserve"> </w:t>
-      </w:r>
-      <w:r>
-        <w:rPr>
-          <w:rFonts w:ascii="Calibri" w:hAnsi="Calibri"/>
-          <w:b/>
-          <w:color w:val="1A1A1A"/>
-          <w:sz w:val="22"/>
-        </w:rPr>
-        <w:t>Mt 5,13–16</w:t>
-      </w:r>
-      <w:r>
-        <w:rPr>
-          <w:rFonts w:ascii="Calibri" w:hAnsi="Calibri"/>
-          <w:color w:val="1A1A1A"/>
-          <w:sz w:val="22"/>
-        </w:rPr>
-        <w:t xml:space="preserve"> — </w:t>
-      </w:r>
-      <w:r>
-        <w:rPr>
-          <w:rFonts w:ascii="Calibri" w:hAnsi="Calibri"/>
-          <w:i/>
-          <w:color w:val="1A1A1A"/>
-          <w:sz w:val="22"/>
-        </w:rPr>
-        <w:t>"Ustedes son la sal de la tierra… ustedes son la luz del mundo. Brille así su luz delante de los hombres."</w:t>
-      </w:r>
-    </w:p>
-    <w:p>
-      <w:pPr>
-        <w:pStyle w:val="ListBullet"/>
-        <w:spacing w:after="20"/>
-      </w:pPr>
-      <w:r>
-        <w:rPr>
-          <w:rFonts w:ascii="Calibri" w:hAnsi="Calibri"/>
-          <w:b/>
-          <w:color w:val="1A1A1A"/>
-          <w:sz w:val="22"/>
-        </w:rPr>
-        <w:t>Materiales:</w:t>
-      </w:r>
-      <w:r>
-        <w:rPr>
-          <w:rFonts w:ascii="Calibri" w:hAnsi="Calibri"/>
-          <w:color w:val="1A1A1A"/>
-          <w:sz w:val="22"/>
-        </w:rPr>
-        <w:t xml:space="preserve"> antifaces de tela negra (uno por participante) · velas.</w:t>
-      </w:r>
-    </w:p>
-    <w:p>
-      <w:pPr>
-        <w:pStyle w:val="ListBullet"/>
-        <w:spacing w:after="20"/>
-      </w:pPr>
-      <w:r>
-        <w:rPr>
-          <w:rFonts w:ascii="Calibri" w:hAnsi="Calibri"/>
-          <w:b/>
-          <w:color w:val="1A1A1A"/>
-          <w:sz w:val="22"/>
-        </w:rPr>
-        <w:t>Texto y ritual del Bayuyo:</w:t>
-      </w:r>
-      <w:r>
-        <w:rPr>
-          <w:rFonts w:ascii="Calibri" w:hAnsi="Calibri"/>
-          <w:color w:val="1A1A1A"/>
-          <w:sz w:val="22"/>
-        </w:rPr>
-        <w:t xml:space="preserve"> </w:t>
-      </w:r>
-      <w:r>
-        <w:rPr>
-          <w:rFonts w:ascii="Calibri" w:hAnsi="Calibri"/>
-          <w:b/>
-          <w:color w:val="1A1A1A"/>
-          <w:sz w:val="22"/>
-        </w:rPr>
-        <w:t>[POR DEFINIR — del cancionero eteciano / Padre Paul].</w:t>
-      </w:r>
-      <w:r>
-        <w:rPr>
-          <w:rFonts w:ascii="Calibri" w:hAnsi="Calibri"/>
-          <w:color w:val="1A1A1A"/>
-          <w:sz w:val="22"/>
-        </w:rPr>
-        <w:t xml:space="preserve"> Es un momento característico del ETC; el texto y el orden los trae Música.</w:t>
-      </w:r>
-    </w:p>
-    <w:p>
-      <w:pPr>
-        <w:keepNext/>
-        <w:spacing w:before="80" w:after="160"/>
-        <w:pBdr>
-          <w:bottom w:val="single" w:sz="12" w:space="4" w:color="E36C4F"/>
-        </w:pBdr>
-      </w:pPr>
-      <w:r>
-        <w:rPr>
-          <w:rFonts w:ascii="Calibri" w:hAnsi="Calibri"/>
-          <w:b/>
-          <w:color w:val="1B3A5C"/>
-          <w:sz w:val="40"/>
-        </w:rPr>
-        <w:t>4. Bendición de los alimentos (cada tiempo de comida)</w:t>
-      </w:r>
-    </w:p>
-    <w:p>
-      <w:pPr>
-        <w:pStyle w:val="ListBullet"/>
-        <w:spacing w:after="20"/>
-      </w:pPr>
-      <w:r>
-        <w:rPr>
-          <w:rFonts w:ascii="Calibri" w:hAnsi="Calibri"/>
-          <w:b/>
-          <w:color w:val="1A1A1A"/>
-          <w:sz w:val="22"/>
-        </w:rPr>
-        <w:t>Cuándo:</w:t>
-      </w:r>
-      <w:r>
-        <w:rPr>
-          <w:rFonts w:ascii="Calibri" w:hAnsi="Calibri"/>
-          <w:color w:val="1A1A1A"/>
-          <w:sz w:val="22"/>
-        </w:rPr>
-        <w:t xml:space="preserve"> antes de cada comida.</w:t>
-      </w:r>
-    </w:p>
-    <w:p>
-      <w:pPr>
-        <w:pStyle w:val="ListBullet"/>
-        <w:spacing w:after="20"/>
-      </w:pPr>
-      <w:r>
-        <w:rPr>
-          <w:rFonts w:ascii="Calibri" w:hAnsi="Calibri"/>
-          <w:b/>
-          <w:color w:val="1A1A1A"/>
-          <w:sz w:val="22"/>
-        </w:rPr>
-        <w:t>Quién:</w:t>
-      </w:r>
-      <w:r>
-        <w:rPr>
-          <w:rFonts w:ascii="Calibri" w:hAnsi="Calibri"/>
-          <w:color w:val="1A1A1A"/>
-          <w:sz w:val="22"/>
-        </w:rPr>
-        <w:t xml:space="preserve"> un cocinero o el designado.</w:t>
-      </w:r>
-    </w:p>
-    <w:p>
-      <w:pPr>
-        <w:pStyle w:val="ListBullet"/>
-        <w:spacing w:after="20"/>
-      </w:pPr>
-      <w:r>
-        <w:rPr>
-          <w:rFonts w:ascii="Calibri" w:hAnsi="Calibri"/>
-          <w:b/>
-          <w:color w:val="1A1A1A"/>
-          <w:sz w:val="22"/>
-        </w:rPr>
-        <w:t>Forma:</w:t>
-      </w:r>
-      <w:r>
-        <w:rPr>
-          <w:rFonts w:ascii="Calibri" w:hAnsi="Calibri"/>
-          <w:color w:val="1A1A1A"/>
-          <w:sz w:val="22"/>
-        </w:rPr>
-        <w:t xml:space="preserve"> </w:t>
-      </w:r>
-      <w:r>
-        <w:rPr>
-          <w:rFonts w:ascii="Calibri" w:hAnsi="Calibri"/>
-          <w:b/>
-          <w:color w:val="1A1A1A"/>
-          <w:sz w:val="22"/>
-        </w:rPr>
-        <w:t>breve</w:t>
-      </w:r>
-      <w:r>
-        <w:rPr>
-          <w:rFonts w:ascii="Calibri" w:hAnsi="Calibri"/>
-          <w:color w:val="1A1A1A"/>
-          <w:sz w:val="22"/>
-        </w:rPr>
-        <w:t>, ligada al tema del día (los gestos o sociodramas breves enriquecen, no se prohíben).</w:t>
-      </w:r>
-    </w:p>
-    <w:p>
-      <w:pPr>
-        <w:pStyle w:val="ListBullet"/>
-        <w:spacing w:after="20"/>
-      </w:pPr>
-      <w:r>
-        <w:rPr>
-          <w:rFonts w:ascii="Calibri" w:hAnsi="Calibri"/>
-          <w:b/>
-          <w:color w:val="1A1A1A"/>
-          <w:sz w:val="22"/>
-        </w:rPr>
-        <w:t>Texto base (ejemplo):</w:t>
+        <w:t xml:space="preserve"> un asesor o guía.</w:t>
       </w:r>
     </w:p>
     <w:tbl>
@@ -16864,10 +16538,25 @@
             <w:r>
               <w:rPr>
                 <w:rFonts w:ascii="Calibri" w:hAnsi="Calibri"/>
+                <w:b/>
                 <w:color w:val="1B3A5C"/>
                 <w:sz w:val="21"/>
               </w:rPr>
-              <w:t>Bendícenos, Señor, y bendice estos alimentos que por tu bondad vamos a recibir. Por Cristo nuestro Señor. Amén.</w:t>
+              <w:t>[PROPUESTA]</w:t>
+            </w:r>
+          </w:p>
+          <w:p>
+            <w:pPr>
+              <w:spacing w:after="20"/>
+            </w:pPr>
+            <w:r>
+              <w:rPr>
+                <w:rFonts w:ascii="Calibri" w:hAnsi="Calibri"/>
+                <w:i/>
+                <w:color w:val="1B3A5C"/>
+                <w:sz w:val="21"/>
+              </w:rPr>
+              <w:t>Señor, al terminar el día te damos gracias por lo vivido. Perdona lo que no hicimos bien, bendice a cada participante y a cada hermano del equipo, y danos descanso para servir mejor mañana. En tus manos nos ponemos. Amén.</w:t>
             </w:r>
           </w:p>
         </w:tc>
@@ -16893,7 +16582,7 @@
           <w:color w:val="1B3A5C"/>
           <w:sz w:val="40"/>
         </w:rPr>
-        <w:t>5. Otros momentos de oración</w:t>
+        <w:t>3. Oración de los participantes a María — sábado AM</w:t>
       </w:r>
     </w:p>
     <w:p>
@@ -16908,15 +16597,32 @@
           <w:color w:val="1A1A1A"/>
           <w:sz w:val="22"/>
         </w:rPr>
-        <w:t>Cadena de oración</w:t>
-      </w:r>
-      <w:r>
-        <w:rPr>
-          <w:rFonts w:ascii="Calibri" w:hAnsi="Calibri"/>
-          <w:color w:val="1A1A1A"/>
-          <w:sz w:val="22"/>
-        </w:rPr>
-        <w:t xml:space="preserve"> (Asesores / Intersección): durante todo el retiro, por turnos, para que se produzca un verdadero encuentro.</w:t>
+        <w:t>Cuándo:</w:t>
+      </w:r>
+      <w:r>
+        <w:rPr>
+          <w:rFonts w:ascii="Calibri" w:hAnsi="Calibri"/>
+          <w:color w:val="1A1A1A"/>
+          <w:sz w:val="22"/>
+        </w:rPr>
+        <w:t xml:space="preserve"> sábado en la mañana, en la capilla. </w:t>
+      </w:r>
+      <w:r>
+        <w:rPr>
+          <w:rFonts w:ascii="Calibri" w:hAnsi="Calibri"/>
+          <w:b/>
+          <w:color w:val="1A1A1A"/>
+          <w:sz w:val="22"/>
+        </w:rPr>
+        <w:t>Quién:</w:t>
+      </w:r>
+      <w:r>
+        <w:rPr>
+          <w:rFonts w:ascii="Calibri" w:hAnsi="Calibri"/>
+          <w:color w:val="1A1A1A"/>
+          <w:sz w:val="22"/>
+        </w:rPr>
+        <w:t xml:space="preserve"> guías designados + Música (cantos marianos).</w:t>
       </w:r>
     </w:p>
     <w:p>
@@ -16931,15 +16637,149 @@
           <w:color w:val="1A1A1A"/>
           <w:sz w:val="22"/>
         </w:rPr>
-        <w:t>Confesiones</w:t>
-      </w:r>
-      <w:r>
-        <w:rPr>
-          <w:rFonts w:ascii="Calibri" w:hAnsi="Calibri"/>
-          <w:color w:val="1A1A1A"/>
-          <w:sz w:val="22"/>
-        </w:rPr>
-        <w:t xml:space="preserve"> (sábado noche): música ambiente de oración mientras los sacerdotes confiesan.</w:t>
+        <w:t>Forma:</w:t>
+      </w:r>
+      <w:r>
+        <w:rPr>
+          <w:rFonts w:ascii="Calibri" w:hAnsi="Calibri"/>
+          <w:color w:val="1A1A1A"/>
+          <w:sz w:val="22"/>
+        </w:rPr>
+        <w:t xml:space="preserve"> el Rosario o una oración inspirada en María.</w:t>
+      </w:r>
+    </w:p>
+    <w:tbl>
+      <w:tblPr>
+        <w:tblW w:type="auto" w:w="0"/>
+        <w:jc w:val="center"/>
+        <w:tblLook w:firstColumn="1" w:firstRow="1" w:lastColumn="0" w:lastRow="0" w:noHBand="0" w:noVBand="1" w:val="04A0"/>
+      </w:tblPr>
+      <w:tblGrid>
+        <w:gridCol w:w="9746"/>
+      </w:tblGrid>
+      <w:tr>
+        <w:tc>
+          <w:tcPr>
+            <w:tcW w:type="dxa" w:w="9071"/>
+            <w:shd w:val="clear" w:color="auto" w:fill="F7F1E3"/>
+            <w:tcBorders>
+              <w:left w:val="single" w:sz="24" w:color="E36C4F"/>
+              <w:top w:val="single" w:sz="4" w:color="E8D4A8"/>
+              <w:right w:val="single" w:sz="4" w:color="E8D4A8"/>
+              <w:bottom w:val="single" w:sz="4" w:color="E8D4A8"/>
+            </w:tcBorders>
+          </w:tcPr>
+          <w:p>
+            <w:pPr>
+              <w:spacing w:after="20"/>
+            </w:pPr>
+            <w:r/>
+            <w:r>
+              <w:rPr>
+                <w:rFonts w:ascii="Calibri" w:hAnsi="Calibri"/>
+                <w:b/>
+                <w:color w:val="1B3A5C"/>
+                <w:sz w:val="21"/>
+              </w:rPr>
+              <w:t>Ave María</w:t>
+            </w:r>
+          </w:p>
+          <w:p>
+            <w:pPr>
+              <w:spacing w:after="20"/>
+            </w:pPr>
+            <w:r>
+              <w:rPr>
+                <w:rFonts w:ascii="Calibri" w:hAnsi="Calibri"/>
+                <w:i/>
+                <w:color w:val="1B3A5C"/>
+                <w:sz w:val="21"/>
+              </w:rPr>
+              <w:t>Dios te salve, María, llena eres de gracia, el Señor es contigo. Bendita tú eres entre todas las mujeres, y bendito es el fruto de tu vientre, Jesús. Santa María, Madre de Dios, ruega por nosotros, pecadores, ahora y en la hora de nuestra muerte. Amén.</w:t>
+            </w:r>
+          </w:p>
+        </w:tc>
+      </w:tr>
+    </w:tbl>
+    <w:p>
+      <w:pPr>
+        <w:spacing w:after="0"/>
+      </w:pPr>
+    </w:p>
+    <w:tbl>
+      <w:tblPr>
+        <w:tblW w:type="auto" w:w="0"/>
+        <w:jc w:val="center"/>
+        <w:tblLook w:firstColumn="1" w:firstRow="1" w:lastColumn="0" w:lastRow="0" w:noHBand="0" w:noVBand="1" w:val="04A0"/>
+      </w:tblPr>
+      <w:tblGrid>
+        <w:gridCol w:w="9746"/>
+      </w:tblGrid>
+      <w:tr>
+        <w:tc>
+          <w:tcPr>
+            <w:tcW w:type="dxa" w:w="9071"/>
+            <w:shd w:val="clear" w:color="auto" w:fill="F7F1E3"/>
+            <w:tcBorders>
+              <w:left w:val="single" w:sz="24" w:color="E36C4F"/>
+              <w:top w:val="single" w:sz="4" w:color="E8D4A8"/>
+              <w:right w:val="single" w:sz="4" w:color="E8D4A8"/>
+              <w:bottom w:val="single" w:sz="4" w:color="E8D4A8"/>
+            </w:tcBorders>
+          </w:tcPr>
+          <w:p>
+            <w:pPr>
+              <w:spacing w:after="20"/>
+            </w:pPr>
+            <w:r/>
+            <w:r>
+              <w:rPr>
+                <w:rFonts w:ascii="Calibri" w:hAnsi="Calibri"/>
+                <w:b/>
+                <w:color w:val="1B3A5C"/>
+                <w:sz w:val="21"/>
+              </w:rPr>
+              <w:t>[PROPUESTA · invocación breve]</w:t>
+            </w:r>
+          </w:p>
+          <w:p>
+            <w:pPr>
+              <w:spacing w:after="20"/>
+            </w:pPr>
+            <w:r>
+              <w:rPr>
+                <w:rFonts w:ascii="Calibri" w:hAnsi="Calibri"/>
+                <w:i/>
+                <w:color w:val="1B3A5C"/>
+                <w:sz w:val="21"/>
+              </w:rPr>
+              <w:t>Madre, ponemos este día en tus manos. Enséñanos a decir "sí" como tú, y acompaña a cada participante en su encuentro con tu Hijo. Amén.</w:t>
+            </w:r>
+          </w:p>
+        </w:tc>
+      </w:tr>
+    </w:tbl>
+    <w:p>
+      <w:pPr>
+        <w:spacing w:after="0"/>
+      </w:pPr>
+    </w:p>
+    <w:p>
+      <w:pPr>
+        <w:keepNext/>
+        <w:spacing w:before="80" w:after="160"/>
+        <w:pBdr>
+          <w:bottom w:val="single" w:sz="12" w:space="4" w:color="E36C4F"/>
+        </w:pBdr>
+      </w:pPr>
+      <w:r>
+        <w:rPr>
+          <w:rFonts w:ascii="Calibri" w:hAnsi="Calibri"/>
+          <w:b/>
+          <w:color w:val="1B3A5C"/>
+          <w:sz w:val="40"/>
+        </w:rPr>
+        <w:t>4. Oración "Sal y Luz del Mundo" — el Bayuyo (viernes noche)</w:t>
       </w:r>
     </w:p>
     <w:p>
@@ -16954,6 +16794,605 @@
           <w:color w:val="1A1A1A"/>
           <w:sz w:val="22"/>
         </w:rPr>
+        <w:t>Cuándo:</w:t>
+      </w:r>
+      <w:r>
+        <w:rPr>
+          <w:rFonts w:ascii="Calibri" w:hAnsi="Calibri"/>
+          <w:color w:val="1A1A1A"/>
+          <w:sz w:val="22"/>
+        </w:rPr>
+        <w:t xml:space="preserve"> viernes en la noche, en el patio. </w:t>
+      </w:r>
+      <w:r>
+        <w:rPr>
+          <w:rFonts w:ascii="Calibri" w:hAnsi="Calibri"/>
+          <w:b/>
+          <w:color w:val="1A1A1A"/>
+          <w:sz w:val="22"/>
+        </w:rPr>
+        <w:t>Quién:</w:t>
+      </w:r>
+      <w:r>
+        <w:rPr>
+          <w:rFonts w:ascii="Calibri" w:hAnsi="Calibri"/>
+          <w:color w:val="1A1A1A"/>
+          <w:sz w:val="22"/>
+        </w:rPr>
+        <w:t xml:space="preserve"> Música conduce.</w:t>
+      </w:r>
+    </w:p>
+    <w:p>
+      <w:pPr>
+        <w:pStyle w:val="ListBullet"/>
+        <w:spacing w:after="20"/>
+      </w:pPr>
+      <w:r>
+        <w:rPr>
+          <w:rFonts w:ascii="Calibri" w:hAnsi="Calibri"/>
+          <w:b/>
+          <w:color w:val="1A1A1A"/>
+          <w:sz w:val="22"/>
+        </w:rPr>
+        <w:t>Materiales:</w:t>
+      </w:r>
+      <w:r>
+        <w:rPr>
+          <w:rFonts w:ascii="Calibri" w:hAnsi="Calibri"/>
+          <w:color w:val="1A1A1A"/>
+          <w:sz w:val="22"/>
+        </w:rPr>
+        <w:t xml:space="preserve"> antifaces de tela negra (uno por participante) · velas.</w:t>
+      </w:r>
+    </w:p>
+    <w:p>
+      <w:pPr>
+        <w:pStyle w:val="ListBullet"/>
+        <w:spacing w:after="20"/>
+      </w:pPr>
+      <w:r>
+        <w:rPr>
+          <w:rFonts w:ascii="Calibri" w:hAnsi="Calibri"/>
+          <w:b/>
+          <w:color w:val="1A1A1A"/>
+          <w:sz w:val="22"/>
+        </w:rPr>
+        <w:t>Base bíblica — Mt 5,13–16</w:t>
+      </w:r>
+      <w:r>
+        <w:rPr>
+          <w:rFonts w:ascii="Calibri" w:hAnsi="Calibri"/>
+          <w:color w:val="1A1A1A"/>
+          <w:sz w:val="22"/>
+        </w:rPr>
+        <w:t xml:space="preserve"> </w:t>
+      </w:r>
+      <w:r>
+        <w:rPr>
+          <w:rFonts w:ascii="Calibri" w:hAnsi="Calibri"/>
+          <w:i/>
+          <w:color w:val="1A1A1A"/>
+          <w:sz w:val="22"/>
+        </w:rPr>
+        <w:t>(se proclama):</w:t>
+      </w:r>
+    </w:p>
+    <w:tbl>
+      <w:tblPr>
+        <w:tblW w:type="auto" w:w="0"/>
+        <w:jc w:val="center"/>
+        <w:tblLook w:firstColumn="1" w:firstRow="1" w:lastColumn="0" w:lastRow="0" w:noHBand="0" w:noVBand="1" w:val="04A0"/>
+      </w:tblPr>
+      <w:tblGrid>
+        <w:gridCol w:w="9746"/>
+      </w:tblGrid>
+      <w:tr>
+        <w:tc>
+          <w:tcPr>
+            <w:tcW w:type="dxa" w:w="9071"/>
+            <w:shd w:val="clear" w:color="auto" w:fill="F7F1E3"/>
+            <w:tcBorders>
+              <w:left w:val="single" w:sz="24" w:color="E36C4F"/>
+              <w:top w:val="single" w:sz="4" w:color="E8D4A8"/>
+              <w:right w:val="single" w:sz="4" w:color="E8D4A8"/>
+              <w:bottom w:val="single" w:sz="4" w:color="E8D4A8"/>
+            </w:tcBorders>
+          </w:tcPr>
+          <w:p>
+            <w:pPr>
+              <w:spacing w:after="20"/>
+            </w:pPr>
+            <w:r/>
+            <w:r>
+              <w:rPr>
+                <w:rFonts w:ascii="Calibri" w:hAnsi="Calibri"/>
+                <w:i/>
+                <w:color w:val="1B3A5C"/>
+                <w:sz w:val="21"/>
+              </w:rPr>
+              <w:t>"Ustedes son la sal de la tierra… Ustedes son la luz del mundo. No se enciende una lámpara para meterla debajo de un cajón, sino para ponerla en el candelero y que alumbre a todos. Brille así la luz de ustedes ante los hombres, para que, viendo sus buenas obras, glorifiquen al Padre que está en el cielo."</w:t>
+            </w:r>
+          </w:p>
+        </w:tc>
+      </w:tr>
+    </w:tbl>
+    <w:p>
+      <w:pPr>
+        <w:spacing w:after="0"/>
+      </w:pPr>
+    </w:p>
+    <w:p>
+      <w:pPr>
+        <w:pStyle w:val="ListBullet"/>
+        <w:spacing w:after="20"/>
+      </w:pPr>
+      <w:r>
+        <w:rPr>
+          <w:rFonts w:ascii="Calibri" w:hAnsi="Calibri"/>
+          <w:b/>
+          <w:color w:val="1A1A1A"/>
+          <w:sz w:val="22"/>
+        </w:rPr>
+        <w:t>Rito del Bayuyo:</w:t>
+      </w:r>
+      <w:r>
+        <w:rPr>
+          <w:rFonts w:ascii="Calibri" w:hAnsi="Calibri"/>
+          <w:color w:val="1A1A1A"/>
+          <w:sz w:val="22"/>
+        </w:rPr>
+        <w:t xml:space="preserve"> con los antifaces puestos y en silencio, se van </w:t>
+      </w:r>
+      <w:r>
+        <w:rPr>
+          <w:rFonts w:ascii="Calibri" w:hAnsi="Calibri"/>
+          <w:b/>
+          <w:color w:val="1A1A1A"/>
+          <w:sz w:val="22"/>
+        </w:rPr>
+        <w:t>encendiendo las velas</w:t>
+      </w:r>
+      <w:r>
+        <w:rPr>
+          <w:rFonts w:ascii="Calibri" w:hAnsi="Calibri"/>
+          <w:color w:val="1A1A1A"/>
+          <w:sz w:val="22"/>
+        </w:rPr>
+        <w:t xml:space="preserve"> una a una mientras se canta; cada luz representa el paso de la oscuridad a la luz de Cristo.</w:t>
+      </w:r>
+    </w:p>
+    <w:tbl>
+      <w:tblPr>
+        <w:tblW w:type="auto" w:w="0"/>
+        <w:jc w:val="center"/>
+        <w:tblLook w:firstColumn="1" w:firstRow="1" w:lastColumn="0" w:lastRow="0" w:noHBand="0" w:noVBand="1" w:val="04A0"/>
+      </w:tblPr>
+      <w:tblGrid>
+        <w:gridCol w:w="9746"/>
+      </w:tblGrid>
+      <w:tr>
+        <w:tc>
+          <w:tcPr>
+            <w:tcW w:type="dxa" w:w="9071"/>
+            <w:shd w:val="clear" w:color="auto" w:fill="F7F1E3"/>
+            <w:tcBorders>
+              <w:left w:val="single" w:sz="24" w:color="E36C4F"/>
+              <w:top w:val="single" w:sz="4" w:color="E8D4A8"/>
+              <w:right w:val="single" w:sz="4" w:color="E8D4A8"/>
+              <w:bottom w:val="single" w:sz="4" w:color="E8D4A8"/>
+            </w:tcBorders>
+          </w:tcPr>
+          <w:p>
+            <w:pPr>
+              <w:spacing w:after="20"/>
+            </w:pPr>
+            <w:r/>
+            <w:r>
+              <w:rPr>
+                <w:rFonts w:ascii="Calibri" w:hAnsi="Calibri"/>
+                <w:b/>
+                <w:color w:val="1B3A5C"/>
+                <w:sz w:val="21"/>
+              </w:rPr>
+              <w:t>[PROPUESTA · guion a confirmar con Padre Paul + Música]</w:t>
+            </w:r>
+          </w:p>
+          <w:p>
+            <w:pPr>
+              <w:spacing w:after="20"/>
+            </w:pPr>
+            <w:r>
+              <w:rPr>
+                <w:rFonts w:ascii="Calibri" w:hAnsi="Calibri"/>
+                <w:i/>
+                <w:color w:val="1B3A5C"/>
+                <w:sz w:val="21"/>
+              </w:rPr>
+              <w:t>En la oscuridad de mi antifaz reconozco lo que aún no veo de mí. (Se enciende la primera vela.) Cristo, Luz del mundo, alumbra mi vida. Hazme sal que dé sabor y luz que no se esconda. Que mi vida brille no para mí, sino para que otros te encuentren. Amén.</w:t>
+            </w:r>
+          </w:p>
+          <w:p>
+            <w:pPr>
+              <w:spacing w:after="20"/>
+            </w:pPr>
+            <w:r>
+              <w:rPr>
+                <w:rFonts w:ascii="Calibri" w:hAnsi="Calibri"/>
+                <w:i/>
+                <w:color w:val="1B3A5C"/>
+                <w:sz w:val="21"/>
+              </w:rPr>
+              <w:t>El texto y los cantos definitivos del Bayuyo los trae el cancionero eteciano (Música + Padre Paul).</w:t>
+            </w:r>
+          </w:p>
+        </w:tc>
+      </w:tr>
+    </w:tbl>
+    <w:p>
+      <w:pPr>
+        <w:spacing w:after="0"/>
+      </w:pPr>
+    </w:p>
+    <w:p>
+      <w:pPr>
+        <w:keepNext/>
+        <w:spacing w:before="80" w:after="160"/>
+        <w:pBdr>
+          <w:bottom w:val="single" w:sz="12" w:space="4" w:color="E36C4F"/>
+        </w:pBdr>
+      </w:pPr>
+      <w:r>
+        <w:rPr>
+          <w:rFonts w:ascii="Calibri" w:hAnsi="Calibri"/>
+          <w:b/>
+          <w:color w:val="1B3A5C"/>
+          <w:sz w:val="40"/>
+        </w:rPr>
+        <w:t>5. Bendición de los alimentos — cada tiempo de comida</w:t>
+      </w:r>
+    </w:p>
+    <w:p>
+      <w:pPr>
+        <w:pStyle w:val="ListBullet"/>
+        <w:spacing w:after="20"/>
+      </w:pPr>
+      <w:r>
+        <w:rPr>
+          <w:rFonts w:ascii="Calibri" w:hAnsi="Calibri"/>
+          <w:b/>
+          <w:color w:val="1A1A1A"/>
+          <w:sz w:val="22"/>
+        </w:rPr>
+        <w:t>Cuándo:</w:t>
+      </w:r>
+      <w:r>
+        <w:rPr>
+          <w:rFonts w:ascii="Calibri" w:hAnsi="Calibri"/>
+          <w:color w:val="1A1A1A"/>
+          <w:sz w:val="22"/>
+        </w:rPr>
+        <w:t xml:space="preserve"> antes de cada comida. </w:t>
+      </w:r>
+      <w:r>
+        <w:rPr>
+          <w:rFonts w:ascii="Calibri" w:hAnsi="Calibri"/>
+          <w:b/>
+          <w:color w:val="1A1A1A"/>
+          <w:sz w:val="22"/>
+        </w:rPr>
+        <w:t>Quién:</w:t>
+      </w:r>
+      <w:r>
+        <w:rPr>
+          <w:rFonts w:ascii="Calibri" w:hAnsi="Calibri"/>
+          <w:color w:val="1A1A1A"/>
+          <w:sz w:val="22"/>
+        </w:rPr>
+        <w:t xml:space="preserve"> un cocinero o el designado. </w:t>
+      </w:r>
+      <w:r>
+        <w:rPr>
+          <w:rFonts w:ascii="Calibri" w:hAnsi="Calibri"/>
+          <w:b/>
+          <w:color w:val="1A1A1A"/>
+          <w:sz w:val="22"/>
+        </w:rPr>
+        <w:t>Forma:</w:t>
+      </w:r>
+      <w:r>
+        <w:rPr>
+          <w:rFonts w:ascii="Calibri" w:hAnsi="Calibri"/>
+          <w:color w:val="1A1A1A"/>
+          <w:sz w:val="22"/>
+        </w:rPr>
+        <w:t xml:space="preserve"> breve, ligada al tema del día.</w:t>
+      </w:r>
+    </w:p>
+    <w:tbl>
+      <w:tblPr>
+        <w:tblW w:type="auto" w:w="0"/>
+        <w:jc w:val="center"/>
+        <w:tblLook w:firstColumn="1" w:firstRow="1" w:lastColumn="0" w:lastRow="0" w:noHBand="0" w:noVBand="1" w:val="04A0"/>
+      </w:tblPr>
+      <w:tblGrid>
+        <w:gridCol w:w="9746"/>
+      </w:tblGrid>
+      <w:tr>
+        <w:tc>
+          <w:tcPr>
+            <w:tcW w:type="dxa" w:w="9071"/>
+            <w:shd w:val="clear" w:color="auto" w:fill="F7F1E3"/>
+            <w:tcBorders>
+              <w:left w:val="single" w:sz="24" w:color="E36C4F"/>
+              <w:top w:val="single" w:sz="4" w:color="E8D4A8"/>
+              <w:right w:val="single" w:sz="4" w:color="E8D4A8"/>
+              <w:bottom w:val="single" w:sz="4" w:color="E8D4A8"/>
+            </w:tcBorders>
+          </w:tcPr>
+          <w:p>
+            <w:pPr>
+              <w:spacing w:after="20"/>
+            </w:pPr>
+            <w:r/>
+            <w:r>
+              <w:rPr>
+                <w:rFonts w:ascii="Calibri" w:hAnsi="Calibri"/>
+                <w:b/>
+                <w:color w:val="1B3A5C"/>
+                <w:sz w:val="21"/>
+              </w:rPr>
+              <w:t>Bendición de la mesa</w:t>
+            </w:r>
+          </w:p>
+          <w:p>
+            <w:pPr>
+              <w:spacing w:after="20"/>
+            </w:pPr>
+            <w:r>
+              <w:rPr>
+                <w:rFonts w:ascii="Calibri" w:hAnsi="Calibri"/>
+                <w:i/>
+                <w:color w:val="1B3A5C"/>
+                <w:sz w:val="21"/>
+              </w:rPr>
+              <w:t>Bendícenos, Señor, y bendice estos alimentos que por tu bondad vamos a recibir. Por Cristo nuestro Señor. Amén.</w:t>
+            </w:r>
+          </w:p>
+        </w:tc>
+      </w:tr>
+    </w:tbl>
+    <w:p>
+      <w:pPr>
+        <w:spacing w:after="0"/>
+      </w:pPr>
+    </w:p>
+    <w:tbl>
+      <w:tblPr>
+        <w:tblW w:type="auto" w:w="0"/>
+        <w:jc w:val="center"/>
+        <w:tblLook w:firstColumn="1" w:firstRow="1" w:lastColumn="0" w:lastRow="0" w:noHBand="0" w:noVBand="1" w:val="04A0"/>
+      </w:tblPr>
+      <w:tblGrid>
+        <w:gridCol w:w="9746"/>
+      </w:tblGrid>
+      <w:tr>
+        <w:tc>
+          <w:tcPr>
+            <w:tcW w:type="dxa" w:w="9071"/>
+            <w:shd w:val="clear" w:color="auto" w:fill="F7F1E3"/>
+            <w:tcBorders>
+              <w:left w:val="single" w:sz="24" w:color="E36C4F"/>
+              <w:top w:val="single" w:sz="4" w:color="E8D4A8"/>
+              <w:right w:val="single" w:sz="4" w:color="E8D4A8"/>
+              <w:bottom w:val="single" w:sz="4" w:color="E8D4A8"/>
+            </w:tcBorders>
+          </w:tcPr>
+          <w:p>
+            <w:pPr>
+              <w:spacing w:after="20"/>
+            </w:pPr>
+            <w:r/>
+            <w:r>
+              <w:rPr>
+                <w:rFonts w:ascii="Calibri" w:hAnsi="Calibri"/>
+                <w:b/>
+                <w:color w:val="1B3A5C"/>
+                <w:sz w:val="21"/>
+              </w:rPr>
+              <w:t>[PROPUESTA · variante ligada al tema]</w:t>
+            </w:r>
+            <w:r>
+              <w:rPr>
+                <w:rFonts w:ascii="Calibri" w:hAnsi="Calibri"/>
+                <w:color w:val="1B3A5C"/>
+                <w:sz w:val="21"/>
+              </w:rPr>
+              <w:t xml:space="preserve"> — una frase corta antes o después de la bendición, según el tema del momento (Singularidad, María, Pescador de Hombres, Lavatorio, Nacer de Nuevo, Despedida). La prepara cocina con el asesor espiritual.</w:t>
+            </w:r>
+          </w:p>
+        </w:tc>
+      </w:tr>
+    </w:tbl>
+    <w:p>
+      <w:pPr>
+        <w:spacing w:after="0"/>
+      </w:pPr>
+    </w:p>
+    <w:p>
+      <w:pPr>
+        <w:keepNext/>
+        <w:spacing w:before="80" w:after="160"/>
+        <w:pBdr>
+          <w:bottom w:val="single" w:sz="12" w:space="4" w:color="E36C4F"/>
+        </w:pBdr>
+      </w:pPr>
+      <w:r>
+        <w:rPr>
+          <w:rFonts w:ascii="Calibri" w:hAnsi="Calibri"/>
+          <w:b/>
+          <w:color w:val="1B3A5C"/>
+          <w:sz w:val="40"/>
+        </w:rPr>
+        <w:t>6. Oración ante el Santísimo — antes de cada testimonio</w:t>
+      </w:r>
+    </w:p>
+    <w:p>
+      <w:pPr>
+        <w:pStyle w:val="ListBullet"/>
+        <w:spacing w:after="20"/>
+      </w:pPr>
+      <w:r>
+        <w:rPr>
+          <w:rFonts w:ascii="Calibri" w:hAnsi="Calibri"/>
+          <w:b/>
+          <w:color w:val="1A1A1A"/>
+          <w:sz w:val="22"/>
+        </w:rPr>
+        <w:t>Cuándo:</w:t>
+      </w:r>
+      <w:r>
+        <w:rPr>
+          <w:rFonts w:ascii="Calibri" w:hAnsi="Calibri"/>
+          <w:color w:val="1A1A1A"/>
+          <w:sz w:val="22"/>
+        </w:rPr>
+        <w:t xml:space="preserve"> los asesores presentan ante el Santísimo a cada persona que va a dar testimonio.</w:t>
+      </w:r>
+    </w:p>
+    <w:tbl>
+      <w:tblPr>
+        <w:tblW w:type="auto" w:w="0"/>
+        <w:jc w:val="center"/>
+        <w:tblLook w:firstColumn="1" w:firstRow="1" w:lastColumn="0" w:lastRow="0" w:noHBand="0" w:noVBand="1" w:val="04A0"/>
+      </w:tblPr>
+      <w:tblGrid>
+        <w:gridCol w:w="9746"/>
+      </w:tblGrid>
+      <w:tr>
+        <w:tc>
+          <w:tcPr>
+            <w:tcW w:type="dxa" w:w="9071"/>
+            <w:shd w:val="clear" w:color="auto" w:fill="F7F1E3"/>
+            <w:tcBorders>
+              <w:left w:val="single" w:sz="24" w:color="E36C4F"/>
+              <w:top w:val="single" w:sz="4" w:color="E8D4A8"/>
+              <w:right w:val="single" w:sz="4" w:color="E8D4A8"/>
+              <w:bottom w:val="single" w:sz="4" w:color="E8D4A8"/>
+            </w:tcBorders>
+          </w:tcPr>
+          <w:p>
+            <w:pPr>
+              <w:spacing w:after="20"/>
+            </w:pPr>
+            <w:r/>
+            <w:r>
+              <w:rPr>
+                <w:rFonts w:ascii="Calibri" w:hAnsi="Calibri"/>
+                <w:b/>
+                <w:color w:val="1B3A5C"/>
+                <w:sz w:val="21"/>
+              </w:rPr>
+              <w:t>[PROPUESTA]</w:t>
+            </w:r>
+          </w:p>
+          <w:p>
+            <w:pPr>
+              <w:spacing w:after="20"/>
+            </w:pPr>
+            <w:r>
+              <w:rPr>
+                <w:rFonts w:ascii="Calibri" w:hAnsi="Calibri"/>
+                <w:i/>
+                <w:color w:val="1B3A5C"/>
+                <w:sz w:val="21"/>
+              </w:rPr>
+              <w:t>Señor, aquí está tu siervo/a que va a compartir su vida. Habla Tú a través de sus palabras; toca el corazón de quien escucha. Que no se busque a sí mismo, sino a Ti. Amén.</w:t>
+            </w:r>
+          </w:p>
+        </w:tc>
+      </w:tr>
+    </w:tbl>
+    <w:p>
+      <w:pPr>
+        <w:spacing w:after="0"/>
+      </w:pPr>
+    </w:p>
+    <w:p>
+      <w:pPr>
+        <w:keepNext/>
+        <w:spacing w:before="80" w:after="160"/>
+        <w:pBdr>
+          <w:bottom w:val="single" w:sz="12" w:space="4" w:color="E36C4F"/>
+        </w:pBdr>
+      </w:pPr>
+      <w:r>
+        <w:rPr>
+          <w:rFonts w:ascii="Calibri" w:hAnsi="Calibri"/>
+          <w:b/>
+          <w:color w:val="1B3A5C"/>
+          <w:sz w:val="40"/>
+        </w:rPr>
+        <w:t>7. Otros momentos de oración</w:t>
+      </w:r>
+    </w:p>
+    <w:p>
+      <w:pPr>
+        <w:pStyle w:val="ListBullet"/>
+        <w:spacing w:after="20"/>
+      </w:pPr>
+      <w:r>
+        <w:rPr>
+          <w:rFonts w:ascii="Calibri" w:hAnsi="Calibri"/>
+          <w:b/>
+          <w:color w:val="1A1A1A"/>
+          <w:sz w:val="22"/>
+        </w:rPr>
+        <w:t>Cadena de oración</w:t>
+      </w:r>
+      <w:r>
+        <w:rPr>
+          <w:rFonts w:ascii="Calibri" w:hAnsi="Calibri"/>
+          <w:color w:val="1A1A1A"/>
+          <w:sz w:val="22"/>
+        </w:rPr>
+        <w:t xml:space="preserve"> (Asesores / Intersección): por turnos, durante todo el retiro, para que se produzca un verdadero encuentro.</w:t>
+      </w:r>
+    </w:p>
+    <w:p>
+      <w:pPr>
+        <w:pStyle w:val="ListBullet"/>
+        <w:spacing w:after="20"/>
+      </w:pPr>
+      <w:r>
+        <w:rPr>
+          <w:rFonts w:ascii="Calibri" w:hAnsi="Calibri"/>
+          <w:b/>
+          <w:color w:val="1A1A1A"/>
+          <w:sz w:val="22"/>
+        </w:rPr>
+        <w:t>Confesiones</w:t>
+      </w:r>
+      <w:r>
+        <w:rPr>
+          <w:rFonts w:ascii="Calibri" w:hAnsi="Calibri"/>
+          <w:color w:val="1A1A1A"/>
+          <w:sz w:val="22"/>
+        </w:rPr>
+        <w:t xml:space="preserve"> (sábado noche): música ambiente de oración mientras los sacerdotes confiesan.</w:t>
+      </w:r>
+    </w:p>
+    <w:p>
+      <w:pPr>
+        <w:pStyle w:val="ListBullet"/>
+        <w:spacing w:after="20"/>
+      </w:pPr>
+      <w:r>
+        <w:rPr>
+          <w:rFonts w:ascii="Calibri" w:hAnsi="Calibri"/>
+          <w:b/>
+          <w:color w:val="1A1A1A"/>
+          <w:sz w:val="22"/>
+        </w:rPr>
         <w:t>Carta de compromiso / Proyecto de Vida</w:t>
       </w:r>
       <w:r>
@@ -16963,6 +17402,29 @@
           <w:sz w:val="22"/>
         </w:rPr>
         <w:t xml:space="preserve"> (sábado): cada participante escribe su compromiso personal con Dios.</w:t>
+      </w:r>
+    </w:p>
+    <w:p>
+      <w:pPr>
+        <w:pStyle w:val="ListBullet"/>
+        <w:spacing w:after="20"/>
+      </w:pPr>
+      <w:r>
+        <w:rPr>
+          <w:rFonts w:ascii="Calibri" w:hAnsi="Calibri"/>
+          <w:b/>
+          <w:color w:val="1A1A1A"/>
+          <w:sz w:val="22"/>
+        </w:rPr>
+        <w:t>Oración de envío</w:t>
+      </w:r>
+      <w:r>
+        <w:rPr>
+          <w:rFonts w:ascii="Calibri" w:hAnsi="Calibri"/>
+          <w:color w:val="1A1A1A"/>
+          <w:sz w:val="22"/>
+        </w:rPr>
+        <w:t xml:space="preserve"> (clausura): la lleva el Padre Paul en la Eucaristía.</w:t>
       </w:r>
     </w:p>
     <w:p>
@@ -16977,7 +17439,7 @@
           <w:color w:val="666666"/>
           <w:sz w:val="22"/>
         </w:rPr>
-        <w:t>Anexo de Oraciones ETC 88 · borrador · los textos del cancionero y el Bayuyo se cierran con Música + Padre Paul.</w:t>
+        <w:t>Anexo de Oraciones ETC 88 · borrador · los textos [PROPUESTA] y los cantos/Bayuyo se confirman con Padre Paul + Sor Angelina + Música.</w:t>
       </w:r>
     </w:p>
     <w:sectPr>

</xml_diff>

<commit_message>
Directorio con cumpleaños (sin cantera) + mensaje de los directores al final
- build_directorio.py: quita la sección de cantera/backups (solo titulares),
  renombra 'diocesanos' → 'Asesores de comunidad' con la comunidad escrita
  (Santo Domingo · La Vega), y agrega cumpleaños a cada servidor.
- build_carpeta_docx.py: inyecta el directorio real (por área, con cumpleaños)
  en la §12 del booklet desde equipo.json (fuente única).
- COPY_GUIA_ETC88.md: §12 con intro breve; NUEVA §13 'Mensaje de los
  directores' al final (borrador) — habla del tema (tesoro/aventura/expedición,
  Mt 6,21) sin meterlo en el cuerpo de los documentos.
- GUIA_DE_GUIAS_88.md: 'backup' (de espacio del PG) → 'lugar alterno' para
  dejar la guía sin la palabra.
- Pipeline regenerado · verify.py 9/9 TODO PASS.

https://claude.ai/code/session_016scja59CycFFrqKgYsUPWh
</commit_message>
<xml_diff>
--- a/entrega_diseno/CARPETA_ETC88.docx
+++ b/entrega_diseno/CARPETA_ETC88.docx
@@ -672,6 +672,19 @@
     </w:p>
     <w:p>
       <w:pPr>
+        <w:spacing w:after="40"/>
+      </w:pPr>
+      <w:r>
+        <w:rPr>
+          <w:rFonts w:ascii="Calibri" w:hAnsi="Calibri"/>
+          <w:color w:val="1A1A1A"/>
+          <w:sz w:val="22"/>
+        </w:rPr>
+        <w:t>13. Mensaje de los directores</w:t>
+      </w:r>
+    </w:p>
+    <w:p>
+      <w:pPr>
         <w:spacing w:before="120"/>
       </w:pPr>
       <w:r>
@@ -8158,62 +8171,1052 @@
         <w:t>12. Directorio del equipo del ETC 88</w:t>
       </w:r>
     </w:p>
-    <w:tbl>
-      <w:tblPr>
-        <w:tblW w:type="auto" w:w="0"/>
-        <w:jc w:val="center"/>
-        <w:tblLook w:firstColumn="1" w:firstRow="1" w:lastColumn="0" w:lastRow="0" w:noHBand="0" w:noVBand="1" w:val="04A0"/>
-      </w:tblPr>
-      <w:tblGrid>
-        <w:gridCol w:w="9746"/>
-      </w:tblGrid>
-      <w:tr>
-        <w:tc>
-          <w:tcPr>
-            <w:tcW w:type="dxa" w:w="9071"/>
-            <w:shd w:val="clear" w:color="auto" w:fill="F7F1E3"/>
-            <w:tcBorders>
-              <w:left w:val="single" w:sz="24" w:color="E36C4F"/>
-              <w:top w:val="single" w:sz="4" w:color="E8D4A8"/>
-              <w:right w:val="single" w:sz="4" w:color="E8D4A8"/>
-              <w:bottom w:val="single" w:sz="4" w:color="E8D4A8"/>
-            </w:tcBorders>
-          </w:tcPr>
-          <w:p>
-            <w:pPr>
-              <w:spacing w:after="20"/>
-            </w:pPr>
-            <w:r/>
-            <w:r>
-              <w:rPr>
-                <w:rFonts w:ascii="Calibri" w:hAnsi="Calibri"/>
-                <w:b/>
-                <w:color w:val="1B3A5C"/>
-                <w:sz w:val="21"/>
-              </w:rPr>
-              <w:t>[ESTA PÁGINA SE COMPLETA AL FINAL — es lo último que limpiamos.]</w:t>
-            </w:r>
-          </w:p>
-          <w:p>
-            <w:pPr>
-              <w:spacing w:after="20"/>
-            </w:pPr>
-            <w:r>
-              <w:rPr>
-                <w:rFonts w:ascii="Calibri" w:hAnsi="Calibri"/>
-                <w:color w:val="1B3A5C"/>
-                <w:sz w:val="21"/>
-              </w:rPr>
-              <w:t>Directorio definitivo del equipo (Co-Directores · Asesores · Asesores Espirituales · Coordinadores y equipo de Guías · Coordinadores y equipo de Cocina · equipo de Música · Asesores de comunidad · Equipos auxiliares) con nombres y contactos. Se rellena cuando se cierren los pendientes del equipo.</w:t>
-            </w:r>
-          </w:p>
-        </w:tc>
-      </w:tr>
-    </w:tbl>
-    <w:p>
-      <w:pPr>
-        <w:spacing w:after="0"/>
-      </w:pPr>
+    <w:p>
+      <w:pPr>
+        <w:keepNext/>
+        <w:spacing w:before="200" w:after="40"/>
+      </w:pPr>
+      <w:r>
+        <w:rPr>
+          <w:rFonts w:ascii="Calibri" w:hAnsi="Calibri"/>
+          <w:b/>
+          <w:color w:val="1B3A5C"/>
+          <w:sz w:val="26"/>
+        </w:rPr>
+        <w:t>Dirección (2)</w:t>
+      </w:r>
+    </w:p>
+    <w:p>
+      <w:pPr>
+        <w:pStyle w:val="ListBullet"/>
+        <w:spacing w:after="20"/>
+      </w:pPr>
+      <w:r>
+        <w:rPr>
+          <w:rFonts w:ascii="Calibri" w:hAnsi="Calibri"/>
+          <w:color w:val="1A1A1A"/>
+          <w:sz w:val="22"/>
+        </w:rPr>
+        <w:t>Jean Carlo De la Cruz Mendez — Director · cumple 12 may</w:t>
+      </w:r>
+    </w:p>
+    <w:p>
+      <w:pPr>
+        <w:pStyle w:val="ListBullet"/>
+        <w:spacing w:after="20"/>
+      </w:pPr>
+      <w:r>
+        <w:rPr>
+          <w:rFonts w:ascii="Calibri" w:hAnsi="Calibri"/>
+          <w:color w:val="1A1A1A"/>
+          <w:sz w:val="22"/>
+        </w:rPr>
+        <w:t>Juan Manuel de la Cruz Méndez — Director · cumple 20 ene</w:t>
+      </w:r>
+    </w:p>
+    <w:p>
+      <w:pPr>
+        <w:keepNext/>
+        <w:spacing w:before="200" w:after="40"/>
+      </w:pPr>
+      <w:r>
+        <w:rPr>
+          <w:rFonts w:ascii="Calibri" w:hAnsi="Calibri"/>
+          <w:b/>
+          <w:color w:val="1B3A5C"/>
+          <w:sz w:val="26"/>
+        </w:rPr>
+        <w:t>Asesores (3)</w:t>
+      </w:r>
+    </w:p>
+    <w:p>
+      <w:pPr>
+        <w:pStyle w:val="ListBullet"/>
+        <w:spacing w:after="20"/>
+      </w:pPr>
+      <w:r>
+        <w:rPr>
+          <w:rFonts w:ascii="Calibri" w:hAnsi="Calibri"/>
+          <w:color w:val="1A1A1A"/>
+          <w:sz w:val="22"/>
+        </w:rPr>
+        <w:t>Frank Morales</w:t>
+      </w:r>
+    </w:p>
+    <w:p>
+      <w:pPr>
+        <w:pStyle w:val="ListBullet"/>
+        <w:spacing w:after="20"/>
+      </w:pPr>
+      <w:r>
+        <w:rPr>
+          <w:rFonts w:ascii="Calibri" w:hAnsi="Calibri"/>
+          <w:color w:val="1A1A1A"/>
+          <w:sz w:val="22"/>
+        </w:rPr>
+        <w:t>Laura Fernández · cumple 26 oct</w:t>
+      </w:r>
+    </w:p>
+    <w:p>
+      <w:pPr>
+        <w:pStyle w:val="ListBullet"/>
+        <w:spacing w:after="20"/>
+      </w:pPr>
+      <w:r>
+        <w:rPr>
+          <w:rFonts w:ascii="Calibri" w:hAnsi="Calibri"/>
+          <w:color w:val="1A1A1A"/>
+          <w:sz w:val="22"/>
+        </w:rPr>
+        <w:t>Tomás Lorenzo · cumple 14 mar</w:t>
+      </w:r>
+    </w:p>
+    <w:p>
+      <w:pPr>
+        <w:keepNext/>
+        <w:spacing w:before="200" w:after="40"/>
+      </w:pPr>
+      <w:r>
+        <w:rPr>
+          <w:rFonts w:ascii="Calibri" w:hAnsi="Calibri"/>
+          <w:b/>
+          <w:color w:val="1B3A5C"/>
+          <w:sz w:val="26"/>
+        </w:rPr>
+        <w:t>Asesores espirituales (2)</w:t>
+      </w:r>
+    </w:p>
+    <w:p>
+      <w:pPr>
+        <w:pStyle w:val="ListBullet"/>
+        <w:spacing w:after="20"/>
+      </w:pPr>
+      <w:r>
+        <w:rPr>
+          <w:rFonts w:ascii="Calibri" w:hAnsi="Calibri"/>
+          <w:color w:val="1A1A1A"/>
+          <w:sz w:val="22"/>
+        </w:rPr>
+        <w:t>Padre Paul Ramírez — (acompaña todo el proceso)</w:t>
+      </w:r>
+    </w:p>
+    <w:p>
+      <w:pPr>
+        <w:pStyle w:val="ListBullet"/>
+        <w:spacing w:after="20"/>
+      </w:pPr>
+      <w:r>
+        <w:rPr>
+          <w:rFonts w:ascii="Calibri" w:hAnsi="Calibri"/>
+          <w:color w:val="1A1A1A"/>
+          <w:sz w:val="22"/>
+        </w:rPr>
+        <w:t>Sor Angelina Lebrón — (acompaña todo el proceso)</w:t>
+      </w:r>
+    </w:p>
+    <w:p>
+      <w:pPr>
+        <w:keepNext/>
+        <w:spacing w:before="200" w:after="40"/>
+      </w:pPr>
+      <w:r>
+        <w:rPr>
+          <w:rFonts w:ascii="Calibri" w:hAnsi="Calibri"/>
+          <w:b/>
+          <w:color w:val="1B3A5C"/>
+          <w:sz w:val="26"/>
+        </w:rPr>
+        <w:t>Guías (14)</w:t>
+      </w:r>
+    </w:p>
+    <w:p>
+      <w:pPr>
+        <w:pStyle w:val="ListBullet"/>
+        <w:spacing w:after="20"/>
+      </w:pPr>
+      <w:r>
+        <w:rPr>
+          <w:rFonts w:ascii="Calibri" w:hAnsi="Calibri"/>
+          <w:color w:val="1A1A1A"/>
+          <w:sz w:val="22"/>
+        </w:rPr>
+        <w:t>Camila Fernández Hazim — Coordinador/a · cumple 18 ago</w:t>
+      </w:r>
+    </w:p>
+    <w:p>
+      <w:pPr>
+        <w:pStyle w:val="ListBullet"/>
+        <w:spacing w:after="20"/>
+      </w:pPr>
+      <w:r>
+        <w:rPr>
+          <w:rFonts w:ascii="Calibri" w:hAnsi="Calibri"/>
+          <w:color w:val="1A1A1A"/>
+          <w:sz w:val="22"/>
+        </w:rPr>
+        <w:t>Priscilla Hidalgo Pou — Coordinador/a · cumple 16 jul</w:t>
+      </w:r>
+    </w:p>
+    <w:p>
+      <w:pPr>
+        <w:pStyle w:val="ListBullet"/>
+        <w:spacing w:after="20"/>
+      </w:pPr>
+      <w:r>
+        <w:rPr>
+          <w:rFonts w:ascii="Calibri" w:hAnsi="Calibri"/>
+          <w:color w:val="1A1A1A"/>
+          <w:sz w:val="22"/>
+        </w:rPr>
+        <w:t>Darianny Rodriguez Belliard · cumple 30 ene</w:t>
+      </w:r>
+    </w:p>
+    <w:p>
+      <w:pPr>
+        <w:pStyle w:val="ListBullet"/>
+        <w:spacing w:after="20"/>
+      </w:pPr>
+      <w:r>
+        <w:rPr>
+          <w:rFonts w:ascii="Calibri" w:hAnsi="Calibri"/>
+          <w:color w:val="1A1A1A"/>
+          <w:sz w:val="22"/>
+        </w:rPr>
+        <w:t>Fernando Cordero · cumple 20 dic</w:t>
+      </w:r>
+    </w:p>
+    <w:p>
+      <w:pPr>
+        <w:pStyle w:val="ListBullet"/>
+        <w:spacing w:after="20"/>
+      </w:pPr>
+      <w:r>
+        <w:rPr>
+          <w:rFonts w:ascii="Calibri" w:hAnsi="Calibri"/>
+          <w:color w:val="1A1A1A"/>
+          <w:sz w:val="22"/>
+        </w:rPr>
+        <w:t>Franklin De Jesús Silverio Delgadillo · cumple 18 feb</w:t>
+      </w:r>
+    </w:p>
+    <w:p>
+      <w:pPr>
+        <w:pStyle w:val="ListBullet"/>
+        <w:spacing w:after="20"/>
+      </w:pPr>
+      <w:r>
+        <w:rPr>
+          <w:rFonts w:ascii="Calibri" w:hAnsi="Calibri"/>
+          <w:color w:val="1A1A1A"/>
+          <w:sz w:val="22"/>
+        </w:rPr>
+        <w:t>Ivanna Marien Mercedes Sosa · cumple 9 nov</w:t>
+      </w:r>
+    </w:p>
+    <w:p>
+      <w:pPr>
+        <w:pStyle w:val="ListBullet"/>
+        <w:spacing w:after="20"/>
+      </w:pPr>
+      <w:r>
+        <w:rPr>
+          <w:rFonts w:ascii="Calibri" w:hAnsi="Calibri"/>
+          <w:color w:val="1A1A1A"/>
+          <w:sz w:val="22"/>
+        </w:rPr>
+        <w:t>Jhonnalia Franchesca Silvestre Guzmán · cumple 20 oct</w:t>
+      </w:r>
+    </w:p>
+    <w:p>
+      <w:pPr>
+        <w:pStyle w:val="ListBullet"/>
+        <w:spacing w:after="20"/>
+      </w:pPr>
+      <w:r>
+        <w:rPr>
+          <w:rFonts w:ascii="Calibri" w:hAnsi="Calibri"/>
+          <w:color w:val="1A1A1A"/>
+          <w:sz w:val="22"/>
+        </w:rPr>
+        <w:t>Jonathan Andres Medina Mota · cumple 26 sep</w:t>
+      </w:r>
+    </w:p>
+    <w:p>
+      <w:pPr>
+        <w:pStyle w:val="ListBullet"/>
+        <w:spacing w:after="20"/>
+      </w:pPr>
+      <w:r>
+        <w:rPr>
+          <w:rFonts w:ascii="Calibri" w:hAnsi="Calibri"/>
+          <w:color w:val="1A1A1A"/>
+          <w:sz w:val="22"/>
+        </w:rPr>
+        <w:t>Juan Pablo Argüello Alzate · cumple 21 ene</w:t>
+      </w:r>
+    </w:p>
+    <w:p>
+      <w:pPr>
+        <w:pStyle w:val="ListBullet"/>
+        <w:spacing w:after="20"/>
+      </w:pPr>
+      <w:r>
+        <w:rPr>
+          <w:rFonts w:ascii="Calibri" w:hAnsi="Calibri"/>
+          <w:color w:val="1A1A1A"/>
+          <w:sz w:val="22"/>
+        </w:rPr>
+        <w:t>Luisa Maria Fiorentino Brugal · cumple 19 may</w:t>
+      </w:r>
+    </w:p>
+    <w:p>
+      <w:pPr>
+        <w:pStyle w:val="ListBullet"/>
+        <w:spacing w:after="20"/>
+      </w:pPr>
+      <w:r>
+        <w:rPr>
+          <w:rFonts w:ascii="Calibri" w:hAnsi="Calibri"/>
+          <w:color w:val="1A1A1A"/>
+          <w:sz w:val="22"/>
+        </w:rPr>
+        <w:t>Oliver Rafael De León Ramírez · cumple 24 abr</w:t>
+      </w:r>
+    </w:p>
+    <w:p>
+      <w:pPr>
+        <w:pStyle w:val="ListBullet"/>
+        <w:spacing w:after="20"/>
+      </w:pPr>
+      <w:r>
+        <w:rPr>
+          <w:rFonts w:ascii="Calibri" w:hAnsi="Calibri"/>
+          <w:color w:val="1A1A1A"/>
+          <w:sz w:val="22"/>
+        </w:rPr>
+        <w:t>Victoria Lorenzo Rivera · cumple 21 sep</w:t>
+      </w:r>
+    </w:p>
+    <w:p>
+      <w:pPr>
+        <w:pStyle w:val="ListBullet"/>
+        <w:spacing w:after="20"/>
+      </w:pPr>
+      <w:r>
+        <w:rPr>
+          <w:rFonts w:ascii="Calibri" w:hAnsi="Calibri"/>
+          <w:color w:val="1A1A1A"/>
+          <w:sz w:val="22"/>
+        </w:rPr>
+        <w:t>Wilka María Reyes Mota · cumple 8 sep</w:t>
+      </w:r>
+    </w:p>
+    <w:p>
+      <w:pPr>
+        <w:pStyle w:val="ListBullet"/>
+        <w:spacing w:after="20"/>
+      </w:pPr>
+      <w:r>
+        <w:rPr>
+          <w:rFonts w:ascii="Calibri" w:hAnsi="Calibri"/>
+          <w:color w:val="1A1A1A"/>
+          <w:sz w:val="22"/>
+        </w:rPr>
+        <w:t>Yelaxni Mota · cumple 25 sep</w:t>
+      </w:r>
+    </w:p>
+    <w:p>
+      <w:pPr>
+        <w:keepNext/>
+        <w:spacing w:before="200" w:after="40"/>
+      </w:pPr>
+      <w:r>
+        <w:rPr>
+          <w:rFonts w:ascii="Calibri" w:hAnsi="Calibri"/>
+          <w:b/>
+          <w:color w:val="1B3A5C"/>
+          <w:sz w:val="26"/>
+        </w:rPr>
+        <w:t>Cocina (21)</w:t>
+      </w:r>
+    </w:p>
+    <w:p>
+      <w:pPr>
+        <w:pStyle w:val="ListBullet"/>
+        <w:spacing w:after="20"/>
+      </w:pPr>
+      <w:r>
+        <w:rPr>
+          <w:rFonts w:ascii="Calibri" w:hAnsi="Calibri"/>
+          <w:color w:val="1A1A1A"/>
+          <w:sz w:val="22"/>
+        </w:rPr>
+        <w:t>Johnnito Richiez Brugal — Coordinador/a · cumple 23 oct</w:t>
+      </w:r>
+    </w:p>
+    <w:p>
+      <w:pPr>
+        <w:pStyle w:val="ListBullet"/>
+        <w:spacing w:after="20"/>
+      </w:pPr>
+      <w:r>
+        <w:rPr>
+          <w:rFonts w:ascii="Calibri" w:hAnsi="Calibri"/>
+          <w:color w:val="1A1A1A"/>
+          <w:sz w:val="22"/>
+        </w:rPr>
+        <w:t>Paloma Mendez — Coordinador/a · cumple 27 jun</w:t>
+      </w:r>
+    </w:p>
+    <w:p>
+      <w:pPr>
+        <w:pStyle w:val="ListBullet"/>
+        <w:spacing w:after="20"/>
+      </w:pPr>
+      <w:r>
+        <w:rPr>
+          <w:rFonts w:ascii="Calibri" w:hAnsi="Calibri"/>
+          <w:color w:val="1A1A1A"/>
+          <w:sz w:val="22"/>
+        </w:rPr>
+        <w:t>Adrián Francisco Santana Puente · cumple 22 ene</w:t>
+      </w:r>
+    </w:p>
+    <w:p>
+      <w:pPr>
+        <w:pStyle w:val="ListBullet"/>
+        <w:spacing w:after="20"/>
+      </w:pPr>
+      <w:r>
+        <w:rPr>
+          <w:rFonts w:ascii="Calibri" w:hAnsi="Calibri"/>
+          <w:color w:val="1A1A1A"/>
+          <w:sz w:val="22"/>
+        </w:rPr>
+        <w:t>Ambar Liz Jáquez Lebrón · cumple 22 sep</w:t>
+      </w:r>
+    </w:p>
+    <w:p>
+      <w:pPr>
+        <w:pStyle w:val="ListBullet"/>
+        <w:spacing w:after="20"/>
+      </w:pPr>
+      <w:r>
+        <w:rPr>
+          <w:rFonts w:ascii="Calibri" w:hAnsi="Calibri"/>
+          <w:color w:val="1A1A1A"/>
+          <w:sz w:val="22"/>
+        </w:rPr>
+        <w:t>Brianelis Abreu Calderón · cumple 12 nov</w:t>
+      </w:r>
+    </w:p>
+    <w:p>
+      <w:pPr>
+        <w:pStyle w:val="ListBullet"/>
+        <w:spacing w:after="20"/>
+      </w:pPr>
+      <w:r>
+        <w:rPr>
+          <w:rFonts w:ascii="Calibri" w:hAnsi="Calibri"/>
+          <w:color w:val="1A1A1A"/>
+          <w:sz w:val="22"/>
+        </w:rPr>
+        <w:t>Candy Elizabeth Gatwood Ramos · cumple 5 ene</w:t>
+      </w:r>
+    </w:p>
+    <w:p>
+      <w:pPr>
+        <w:pStyle w:val="ListBullet"/>
+        <w:spacing w:after="20"/>
+      </w:pPr>
+      <w:r>
+        <w:rPr>
+          <w:rFonts w:ascii="Calibri" w:hAnsi="Calibri"/>
+          <w:color w:val="1A1A1A"/>
+          <w:sz w:val="22"/>
+        </w:rPr>
+        <w:t>Chantal Melissa Carpio Jiménez · cumple 24 dic</w:t>
+      </w:r>
+    </w:p>
+    <w:p>
+      <w:pPr>
+        <w:pStyle w:val="ListBullet"/>
+        <w:spacing w:after="20"/>
+      </w:pPr>
+      <w:r>
+        <w:rPr>
+          <w:rFonts w:ascii="Calibri" w:hAnsi="Calibri"/>
+          <w:color w:val="1A1A1A"/>
+          <w:sz w:val="22"/>
+        </w:rPr>
+        <w:t>Dayrelins Jazmin Santana Salas · cumple 30 ago</w:t>
+      </w:r>
+    </w:p>
+    <w:p>
+      <w:pPr>
+        <w:pStyle w:val="ListBullet"/>
+        <w:spacing w:after="20"/>
+      </w:pPr>
+      <w:r>
+        <w:rPr>
+          <w:rFonts w:ascii="Calibri" w:hAnsi="Calibri"/>
+          <w:color w:val="1A1A1A"/>
+          <w:sz w:val="22"/>
+        </w:rPr>
+        <w:t>Fabelly Maciel Fabian Bello · cumple 11 ago</w:t>
+      </w:r>
+    </w:p>
+    <w:p>
+      <w:pPr>
+        <w:pStyle w:val="ListBullet"/>
+        <w:spacing w:after="20"/>
+      </w:pPr>
+      <w:r>
+        <w:rPr>
+          <w:rFonts w:ascii="Calibri" w:hAnsi="Calibri"/>
+          <w:color w:val="1A1A1A"/>
+          <w:sz w:val="22"/>
+        </w:rPr>
+        <w:t>Guido Maldonado · cumple 30 nov</w:t>
+      </w:r>
+    </w:p>
+    <w:p>
+      <w:pPr>
+        <w:pStyle w:val="ListBullet"/>
+        <w:spacing w:after="20"/>
+      </w:pPr>
+      <w:r>
+        <w:rPr>
+          <w:rFonts w:ascii="Calibri" w:hAnsi="Calibri"/>
+          <w:color w:val="1A1A1A"/>
+          <w:sz w:val="22"/>
+        </w:rPr>
+        <w:t>Jordelis Mateo · cumple 26 jul</w:t>
+      </w:r>
+    </w:p>
+    <w:p>
+      <w:pPr>
+        <w:pStyle w:val="ListBullet"/>
+        <w:spacing w:after="20"/>
+      </w:pPr>
+      <w:r>
+        <w:rPr>
+          <w:rFonts w:ascii="Calibri" w:hAnsi="Calibri"/>
+          <w:color w:val="1A1A1A"/>
+          <w:sz w:val="22"/>
+        </w:rPr>
+        <w:t>Kelvin Alexis Ventura Santana · cumple 28 jul</w:t>
+      </w:r>
+    </w:p>
+    <w:p>
+      <w:pPr>
+        <w:pStyle w:val="ListBullet"/>
+        <w:spacing w:after="20"/>
+      </w:pPr>
+      <w:r>
+        <w:rPr>
+          <w:rFonts w:ascii="Calibri" w:hAnsi="Calibri"/>
+          <w:color w:val="1A1A1A"/>
+          <w:sz w:val="22"/>
+        </w:rPr>
+        <w:t>Maria del Carmen Mejías Mateo · cumple 29 ago</w:t>
+      </w:r>
+    </w:p>
+    <w:p>
+      <w:pPr>
+        <w:pStyle w:val="ListBullet"/>
+        <w:spacing w:after="20"/>
+      </w:pPr>
+      <w:r>
+        <w:rPr>
+          <w:rFonts w:ascii="Calibri" w:hAnsi="Calibri"/>
+          <w:color w:val="1A1A1A"/>
+          <w:sz w:val="22"/>
+        </w:rPr>
+        <w:t>Marian Olanlly Ortiz Carrasco</w:t>
+      </w:r>
+    </w:p>
+    <w:p>
+      <w:pPr>
+        <w:pStyle w:val="ListBullet"/>
+        <w:spacing w:after="20"/>
+      </w:pPr>
+      <w:r>
+        <w:rPr>
+          <w:rFonts w:ascii="Calibri" w:hAnsi="Calibri"/>
+          <w:color w:val="1A1A1A"/>
+          <w:sz w:val="22"/>
+        </w:rPr>
+        <w:t>Randol Joseph Payano</w:t>
+      </w:r>
+    </w:p>
+    <w:p>
+      <w:pPr>
+        <w:pStyle w:val="ListBullet"/>
+        <w:spacing w:after="20"/>
+      </w:pPr>
+      <w:r>
+        <w:rPr>
+          <w:rFonts w:ascii="Calibri" w:hAnsi="Calibri"/>
+          <w:color w:val="1A1A1A"/>
+          <w:sz w:val="22"/>
+        </w:rPr>
+        <w:t>Risaira Santana Rosario · cumple 29 jun</w:t>
+      </w:r>
+    </w:p>
+    <w:p>
+      <w:pPr>
+        <w:pStyle w:val="ListBullet"/>
+        <w:spacing w:after="20"/>
+      </w:pPr>
+      <w:r>
+        <w:rPr>
+          <w:rFonts w:ascii="Calibri" w:hAnsi="Calibri"/>
+          <w:color w:val="1A1A1A"/>
+          <w:sz w:val="22"/>
+        </w:rPr>
+        <w:t>Risairi Santana Rosario · cumple 28 mar</w:t>
+      </w:r>
+    </w:p>
+    <w:p>
+      <w:pPr>
+        <w:pStyle w:val="ListBullet"/>
+        <w:spacing w:after="20"/>
+      </w:pPr>
+      <w:r>
+        <w:rPr>
+          <w:rFonts w:ascii="Calibri" w:hAnsi="Calibri"/>
+          <w:color w:val="1A1A1A"/>
+          <w:sz w:val="22"/>
+        </w:rPr>
+        <w:t>Roberto Figueroa · cumple 12 may</w:t>
+      </w:r>
+    </w:p>
+    <w:p>
+      <w:pPr>
+        <w:pStyle w:val="ListBullet"/>
+        <w:spacing w:after="20"/>
+      </w:pPr>
+      <w:r>
+        <w:rPr>
+          <w:rFonts w:ascii="Calibri" w:hAnsi="Calibri"/>
+          <w:color w:val="1A1A1A"/>
+          <w:sz w:val="22"/>
+        </w:rPr>
+        <w:t>Roselyn Quiroz · cumple 2 nov</w:t>
+      </w:r>
+    </w:p>
+    <w:p>
+      <w:pPr>
+        <w:pStyle w:val="ListBullet"/>
+        <w:spacing w:after="20"/>
+      </w:pPr>
+      <w:r>
+        <w:rPr>
+          <w:rFonts w:ascii="Calibri" w:hAnsi="Calibri"/>
+          <w:color w:val="1A1A1A"/>
+          <w:sz w:val="22"/>
+        </w:rPr>
+        <w:t>Tommy Nova Nolasco · cumple 7 sep</w:t>
+      </w:r>
+    </w:p>
+    <w:p>
+      <w:pPr>
+        <w:pStyle w:val="ListBullet"/>
+        <w:spacing w:after="20"/>
+      </w:pPr>
+      <w:r>
+        <w:rPr>
+          <w:rFonts w:ascii="Calibri" w:hAnsi="Calibri"/>
+          <w:color w:val="1A1A1A"/>
+          <w:sz w:val="22"/>
+        </w:rPr>
+        <w:t>Wirna Miguelina Stapleton Pilier · cumple 29 sep</w:t>
+      </w:r>
+    </w:p>
+    <w:p>
+      <w:pPr>
+        <w:keepNext/>
+        <w:spacing w:before="200" w:after="40"/>
+      </w:pPr>
+      <w:r>
+        <w:rPr>
+          <w:rFonts w:ascii="Calibri" w:hAnsi="Calibri"/>
+          <w:b/>
+          <w:color w:val="1B3A5C"/>
+          <w:sz w:val="26"/>
+        </w:rPr>
+        <w:t>Música (6)</w:t>
+      </w:r>
+    </w:p>
+    <w:p>
+      <w:pPr>
+        <w:pStyle w:val="ListBullet"/>
+        <w:spacing w:after="20"/>
+      </w:pPr>
+      <w:r>
+        <w:rPr>
+          <w:rFonts w:ascii="Calibri" w:hAnsi="Calibri"/>
+          <w:color w:val="1A1A1A"/>
+          <w:sz w:val="22"/>
+        </w:rPr>
+        <w:t>José Ángel Tusen Russo — Coordinador/a · cumple 30 oct</w:t>
+      </w:r>
+    </w:p>
+    <w:p>
+      <w:pPr>
+        <w:pStyle w:val="ListBullet"/>
+        <w:spacing w:after="20"/>
+      </w:pPr>
+      <w:r>
+        <w:rPr>
+          <w:rFonts w:ascii="Calibri" w:hAnsi="Calibri"/>
+          <w:color w:val="1A1A1A"/>
+          <w:sz w:val="22"/>
+        </w:rPr>
+        <w:t>Daylin M Rambalde Moreta</w:t>
+      </w:r>
+    </w:p>
+    <w:p>
+      <w:pPr>
+        <w:pStyle w:val="ListBullet"/>
+        <w:spacing w:after="20"/>
+      </w:pPr>
+      <w:r>
+        <w:rPr>
+          <w:rFonts w:ascii="Calibri" w:hAnsi="Calibri"/>
+          <w:color w:val="1A1A1A"/>
+          <w:sz w:val="22"/>
+        </w:rPr>
+        <w:t>Dorian Elina Rodriguez Belliard · cumple 21 mar</w:t>
+      </w:r>
+    </w:p>
+    <w:p>
+      <w:pPr>
+        <w:pStyle w:val="ListBullet"/>
+        <w:spacing w:after="20"/>
+      </w:pPr>
+      <w:r>
+        <w:rPr>
+          <w:rFonts w:ascii="Calibri" w:hAnsi="Calibri"/>
+          <w:color w:val="1A1A1A"/>
+          <w:sz w:val="22"/>
+        </w:rPr>
+        <w:t>Ismarie Sthepanie Constanzo Ramos · cumple 14 jun</w:t>
+      </w:r>
+    </w:p>
+    <w:p>
+      <w:pPr>
+        <w:pStyle w:val="ListBullet"/>
+        <w:spacing w:after="20"/>
+      </w:pPr>
+      <w:r>
+        <w:rPr>
+          <w:rFonts w:ascii="Calibri" w:hAnsi="Calibri"/>
+          <w:color w:val="1A1A1A"/>
+          <w:sz w:val="22"/>
+        </w:rPr>
+        <w:t>Leober Carrion Soriano · cumple 4 oct</w:t>
+      </w:r>
+    </w:p>
+    <w:p>
+      <w:pPr>
+        <w:pStyle w:val="ListBullet"/>
+        <w:spacing w:after="20"/>
+      </w:pPr>
+      <w:r>
+        <w:rPr>
+          <w:rFonts w:ascii="Calibri" w:hAnsi="Calibri"/>
+          <w:color w:val="1A1A1A"/>
+          <w:sz w:val="22"/>
+        </w:rPr>
+        <w:t>Mary Carmen Ramírez Vásquez · cumple 29 ago</w:t>
+      </w:r>
+    </w:p>
+    <w:p>
+      <w:pPr>
+        <w:keepNext/>
+        <w:spacing w:before="200" w:after="40"/>
+      </w:pPr>
+      <w:r>
+        <w:rPr>
+          <w:rFonts w:ascii="Calibri" w:hAnsi="Calibri"/>
+          <w:b/>
+          <w:color w:val="1B3A5C"/>
+          <w:sz w:val="26"/>
+        </w:rPr>
+        <w:t>Asesoras de cocina (2)</w:t>
+      </w:r>
+    </w:p>
+    <w:p>
+      <w:pPr>
+        <w:pStyle w:val="ListBullet"/>
+        <w:spacing w:after="20"/>
+      </w:pPr>
+      <w:r>
+        <w:rPr>
+          <w:rFonts w:ascii="Calibri" w:hAnsi="Calibri"/>
+          <w:color w:val="1A1A1A"/>
+          <w:sz w:val="22"/>
+        </w:rPr>
+        <w:t>Johanny García</w:t>
+      </w:r>
+    </w:p>
+    <w:p>
+      <w:pPr>
+        <w:pStyle w:val="ListBullet"/>
+        <w:spacing w:after="20"/>
+      </w:pPr>
+      <w:r>
+        <w:rPr>
+          <w:rFonts w:ascii="Calibri" w:hAnsi="Calibri"/>
+          <w:color w:val="1A1A1A"/>
+          <w:sz w:val="22"/>
+        </w:rPr>
+        <w:t>Mary "Petra" Morales</w:t>
+      </w:r>
+    </w:p>
+    <w:p>
+      <w:pPr>
+        <w:keepNext/>
+        <w:spacing w:before="200" w:after="40"/>
+      </w:pPr>
+      <w:r>
+        <w:rPr>
+          <w:rFonts w:ascii="Calibri" w:hAnsi="Calibri"/>
+          <w:b/>
+          <w:color w:val="1B3A5C"/>
+          <w:sz w:val="26"/>
+        </w:rPr>
+        <w:t>Asesores de comunidad (3)</w:t>
+      </w:r>
+    </w:p>
+    <w:p>
+      <w:pPr>
+        <w:pStyle w:val="ListBullet"/>
+        <w:spacing w:after="20"/>
+      </w:pPr>
+      <w:r>
+        <w:rPr>
+          <w:rFonts w:ascii="Calibri" w:hAnsi="Calibri"/>
+          <w:color w:val="1A1A1A"/>
+          <w:sz w:val="22"/>
+        </w:rPr>
+        <w:t>Leticia González — La Vega</w:t>
+      </w:r>
+    </w:p>
+    <w:p>
+      <w:pPr>
+        <w:pStyle w:val="ListBullet"/>
+        <w:spacing w:after="20"/>
+      </w:pPr>
+      <w:r>
+        <w:rPr>
+          <w:rFonts w:ascii="Calibri" w:hAnsi="Calibri"/>
+          <w:color w:val="1A1A1A"/>
+          <w:sz w:val="22"/>
+        </w:rPr>
+        <w:t>Marleny — Santo Domingo</w:t>
+      </w:r>
+    </w:p>
+    <w:p>
+      <w:pPr>
+        <w:pStyle w:val="ListBullet"/>
+        <w:spacing w:after="20"/>
+      </w:pPr>
+      <w:r>
+        <w:rPr>
+          <w:rFonts w:ascii="Calibri" w:hAnsi="Calibri"/>
+          <w:color w:val="1A1A1A"/>
+          <w:sz w:val="22"/>
+        </w:rPr>
+        <w:t>Sandrita — Santo Domingo</w:t>
+      </w:r>
+    </w:p>
+    <w:p>
+      <w:pPr>
+        <w:spacing w:after="80"/>
+        <w:jc w:val="both"/>
+      </w:pPr>
+      <w:r>
+        <w:rPr>
+          <w:rFonts w:ascii="Calibri" w:hAnsi="Calibri"/>
+          <w:color w:val="1A1A1A"/>
+          <w:sz w:val="22"/>
+        </w:rPr>
+        <w:t xml:space="preserve">Lista del equipo por área, con cumpleaños. Los datos de contacto viven en la hoja </w:t>
+      </w:r>
+      <w:r>
+        <w:rPr>
+          <w:rFonts w:ascii="Calibri" w:hAnsi="Calibri"/>
+          <w:b/>
+          <w:color w:val="1A1A1A"/>
+          <w:sz w:val="22"/>
+        </w:rPr>
+        <w:t>Equipo_ETC88.xlsx</w:t>
+      </w:r>
+      <w:r>
+        <w:rPr>
+          <w:rFonts w:ascii="Calibri" w:hAnsi="Calibri"/>
+          <w:color w:val="1A1A1A"/>
+          <w:sz w:val="22"/>
+        </w:rPr>
+        <w:t>.</w:t>
+      </w:r>
+    </w:p>
+    <w:p>
+      <w:r>
+        <w:br w:type="page"/>
+      </w:r>
+    </w:p>
+    <w:p>
+      <w:pPr>
+        <w:keepNext/>
+        <w:spacing w:before="80" w:after="160"/>
+        <w:pBdr>
+          <w:bottom w:val="single" w:sz="12" w:space="4" w:color="E36C4F"/>
+        </w:pBdr>
+      </w:pPr>
+      <w:r>
+        <w:rPr>
+          <w:rFonts w:ascii="Calibri" w:hAnsi="Calibri"/>
+          <w:b/>
+          <w:color w:val="1B3A5C"/>
+          <w:sz w:val="40"/>
+        </w:rPr>
+        <w:t>13. Mensaje de los directores</w:t>
+      </w:r>
+    </w:p>
+    <w:p>
+      <w:pPr>
+        <w:spacing w:after="80"/>
+        <w:jc w:val="both"/>
+      </w:pPr>
+      <w:r>
+        <w:rPr>
+          <w:rFonts w:ascii="Calibri" w:hAnsi="Calibri"/>
+          <w:i/>
+          <w:color w:val="666666"/>
+          <w:sz w:val="22"/>
+        </w:rPr>
+        <w:t>(Borrador para que los directores lo ajusten y firmen.)</w:t>
+      </w:r>
+    </w:p>
+    <w:p>
+      <w:pPr>
+        <w:spacing w:after="80"/>
+        <w:jc w:val="both"/>
+      </w:pPr>
+      <w:r>
+        <w:rPr>
+          <w:rFonts w:ascii="Calibri" w:hAnsi="Calibri"/>
+          <w:color w:val="1A1A1A"/>
+          <w:sz w:val="22"/>
+        </w:rPr>
+        <w:t xml:space="preserve">Querido equipo: este retiro es, antes que nada, una </w:t>
+      </w:r>
+      <w:r>
+        <w:rPr>
+          <w:rFonts w:ascii="Calibri" w:hAnsi="Calibri"/>
+          <w:b/>
+          <w:color w:val="1A1A1A"/>
+          <w:sz w:val="22"/>
+        </w:rPr>
+        <w:t>aventura</w:t>
+      </w:r>
+      <w:r>
+        <w:rPr>
+          <w:rFonts w:ascii="Calibri" w:hAnsi="Calibri"/>
+          <w:color w:val="1A1A1A"/>
+          <w:sz w:val="22"/>
+        </w:rPr>
+        <w:t xml:space="preserve"> — una expedición en busca del verdadero tesoro. Jesús lo dijo claro: </w:t>
+      </w:r>
+      <w:r>
+        <w:rPr>
+          <w:rFonts w:ascii="Calibri" w:hAnsi="Calibri"/>
+          <w:i/>
+          <w:color w:val="1A1A1A"/>
+          <w:sz w:val="22"/>
+        </w:rPr>
+        <w:t>"donde está tu tesoro, allí estará también tu corazón"</w:t>
+      </w:r>
+      <w:r>
+        <w:rPr>
+          <w:rFonts w:ascii="Calibri" w:hAnsi="Calibri"/>
+          <w:color w:val="1A1A1A"/>
+          <w:sz w:val="22"/>
+        </w:rPr>
+        <w:t xml:space="preserve"> (Mt 6,21). Y prometió que quien halla ese tesoro escondido, de pura alegría, lo deja todo por él (Mt 13,44).</w:t>
+      </w:r>
+    </w:p>
+    <w:p>
+      <w:pPr>
+        <w:spacing w:after="80"/>
+        <w:jc w:val="both"/>
+      </w:pPr>
+      <w:r>
+        <w:rPr>
+          <w:rFonts w:ascii="Calibri" w:hAnsi="Calibri"/>
+          <w:color w:val="1A1A1A"/>
+          <w:sz w:val="22"/>
+        </w:rPr>
+        <w:t>Durante tres días vamos a acompañar a cada participante a encontrar ese tesoro, que es Cristo mismo. Pero el primer corazón que tiene que dejarse encontrar es el nuestro: servimos mejor cuando nosotros también buscamos. No vinimos a lucirnos; vinimos a poner el corazón donde está el tesoro, y a remar juntos para que otro lo halle.</w:t>
+      </w:r>
+    </w:p>
+    <w:p>
+      <w:pPr>
+        <w:spacing w:after="80"/>
+        <w:jc w:val="both"/>
+      </w:pPr>
+      <w:r>
+        <w:rPr>
+          <w:rFonts w:ascii="Calibri" w:hAnsi="Calibri"/>
+          <w:color w:val="1A1A1A"/>
+          <w:sz w:val="22"/>
+        </w:rPr>
+        <w:t xml:space="preserve">Gracias por decir que sí. Cuiden los detalles, cuídense entre ustedes y déjense sorprender por lo que Dios va a hacer. Como nos recordamos siempre: </w:t>
+      </w:r>
+      <w:r>
+        <w:rPr>
+          <w:rFonts w:ascii="Calibri" w:hAnsi="Calibri"/>
+          <w:b/>
+          <w:color w:val="1A1A1A"/>
+          <w:sz w:val="22"/>
+        </w:rPr>
+        <w:t>somos siempre amigos</w:t>
+      </w:r>
+      <w:r>
+        <w:rPr>
+          <w:rFonts w:ascii="Calibri" w:hAnsi="Calibri"/>
+          <w:color w:val="1A1A1A"/>
+          <w:sz w:val="22"/>
+        </w:rPr>
+        <w:t xml:space="preserve"> (Jn 15,15).</w:t>
+      </w:r>
+    </w:p>
+    <w:p>
+      <w:pPr>
+        <w:spacing w:after="80"/>
+        <w:jc w:val="both"/>
+      </w:pPr>
+      <w:r>
+        <w:rPr>
+          <w:rFonts w:ascii="Calibri" w:hAnsi="Calibri"/>
+          <w:b/>
+          <w:color w:val="1A1A1A"/>
+          <w:sz w:val="22"/>
+        </w:rPr>
+        <w:t>Juan Manuel de la Cruz · Jean Carlo de la Cruz</w:t>
+      </w:r>
+      <w:r>
+        <w:rPr>
+          <w:rFonts w:ascii="Calibri" w:hAnsi="Calibri"/>
+          <w:color w:val="1A1A1A"/>
+          <w:sz w:val="22"/>
+        </w:rPr>
+        <w:t xml:space="preserve"> — Co-Directores del ETC 88</w:t>
+      </w:r>
     </w:p>
     <w:p>
       <w:pPr>
@@ -10058,15 +11061,15 @@
           <w:color w:val="1A1A1A"/>
           <w:sz w:val="22"/>
         </w:rPr>
-        <w:t>Definir con tiempo el espacio del PG y tener un backup</w:t>
-      </w:r>
-      <w:r>
-        <w:rPr>
-          <w:rFonts w:ascii="Calibri" w:hAnsi="Calibri"/>
-          <w:color w:val="1A1A1A"/>
-          <w:sz w:val="22"/>
-        </w:rPr>
-        <w:t xml:space="preserve"> por si el lugar asignado no sirve. </w:t>
+        <w:t>Definir con tiempo el espacio del PG y tener un lugar alterno</w:t>
+      </w:r>
+      <w:r>
+        <w:rPr>
+          <w:rFonts w:ascii="Calibri" w:hAnsi="Calibri"/>
+          <w:color w:val="1A1A1A"/>
+          <w:sz w:val="22"/>
+        </w:rPr>
+        <w:t xml:space="preserve"> por si el asignado no sirve. </w:t>
       </w:r>
       <w:r>
         <w:rPr>

</xml_diff>

<commit_message>
Roster: Randol/Olanlly/Daylin con cumpleaños + teléfono del form vivo
Datos leídos de la hoja viva (Drive id 1Vx0…) que respondieron 2-jun-2026,
después del snapshot del xlsx. Solo se importan al repo los datos del
DIRECTORIO (nombre, cumpleaños, teléfono, talla, ETC propio) — la info
sensible (alergias, condiciones, medicamentos, miedos, invitados) se queda
en Drive con sus controles.

- Marian Olanlly Ortiz Carrasco · 23 oct · (849) 406-2313 · S · ETC 85
- Randol Joseph Payano · 18 dic · (829) 963-9360 · L · ETC 85
- Daylin M Rambalde Moreta · 23 nov · (829) 863-9956 · M · ETC 66

Quedan SIN cumpleaños/teléfono (no respondieron form o son externos):
Frank · Paul (cumple) · Sor Angelina (cumple) · Petra · Johanny · 3 asesores
de comunidad (estos últimos no necesarios en booklet — ya enmascarados por
comunidad).
</commit_message>
<xml_diff>
--- a/entrega_diseno/CARPETA_ETC88.docx
+++ b/entrega_diseno/CARPETA_ETC88.docx
@@ -8733,7 +8733,7 @@
           <w:color w:val="1A1A1A"/>
           <w:sz w:val="22"/>
         </w:rPr>
-        <w:t>Marian Olanlly Ortiz Carrasco</w:t>
+        <w:t>Marian Olanlly Ortiz Carrasco · cumple 23 oct</w:t>
       </w:r>
     </w:p>
     <w:p>
@@ -8747,7 +8747,7 @@
           <w:color w:val="1A1A1A"/>
           <w:sz w:val="22"/>
         </w:rPr>
-        <w:t>Randol Joseph Payano</w:t>
+        <w:t>Randol Joseph Payano · cumple 18 dic</w:t>
       </w:r>
     </w:p>
     <w:p>
@@ -8874,7 +8874,7 @@
           <w:color w:val="1A1A1A"/>
           <w:sz w:val="22"/>
         </w:rPr>
-        <w:t>Daylin M Rambalde Moreta</w:t>
+        <w:t>Daylin M Rambalde Moreta · cumple 23 nov</w:t>
       </w:r>
     </w:p>
     <w:p>

</xml_diff>

<commit_message>
Cambio de equipo 7-jun: Fabelly sale, Merkin Jean sube a titular cocina
Decisión del director (7-jun): Fabelly Maciel Fabian Bello SALE del
equipo completamente. Merkin (que estaba en backups de cocina) SUBE a
titular cocina con nombre "Merkin Jean" (apellido pendiente).

Cambios:
- build_data.py: REMOVED_FROM_TEAM filtra a Fabelly del xlsx;
  PLACEHOLDERS_OP agrega "Merkin Jean" como titular cocina;
  Merkin sale de PLACEHOLDERS_BACKUP_COCINA; 5 banderas históricas
  actualizadas (#5, #11, #16, #32, #33) para reflejar el cambio.
- estado.json: total_equipo 72→71, backups 19→18, backups_detalle
  cocina 16→15. Cocina titulares sigue en 21 (Merkin Jean reemplaza
  a Fabelly). Agregada decisión en decisiones_confirmadas + nota en
  la frase histórica de backups del 4-jun.

Verify pasa 9/9. Directorio para Claude Design actualizado.

Pendiente: apellido completo de Merkin Jean (cuando el director lo
confirme, se actualiza en build_data.py línea ~257).
</commit_message>
<xml_diff>
--- a/entrega_diseno/CARPETA_ETC88.docx
+++ b/entrega_diseno/CARPETA_ETC88.docx
@@ -8663,7 +8663,7 @@
           <w:color w:val="1A1A1A"/>
           <w:sz w:val="22"/>
         </w:rPr>
-        <w:t>Fabelly Maciel Fabian Bello · cumple 11 ago</w:t>
+        <w:t>Guido Maldonado · cumple 30 nov</w:t>
       </w:r>
     </w:p>
     <w:p>
@@ -8677,7 +8677,7 @@
           <w:color w:val="1A1A1A"/>
           <w:sz w:val="22"/>
         </w:rPr>
-        <w:t>Guido Maldonado · cumple 30 nov</w:t>
+        <w:t>Jordelis Mateo · cumple 26 jul</w:t>
       </w:r>
     </w:p>
     <w:p>
@@ -8691,7 +8691,7 @@
           <w:color w:val="1A1A1A"/>
           <w:sz w:val="22"/>
         </w:rPr>
-        <w:t>Jordelis Mateo · cumple 26 jul</w:t>
+        <w:t>Kelvin Alexis Ventura Santana · cumple 28 jul</w:t>
       </w:r>
     </w:p>
     <w:p>
@@ -8705,7 +8705,7 @@
           <w:color w:val="1A1A1A"/>
           <w:sz w:val="22"/>
         </w:rPr>
-        <w:t>Kelvin Alexis Ventura Santana · cumple 28 jul</w:t>
+        <w:t>Maria del Carmen Mejías Mateo · cumple 29 ago</w:t>
       </w:r>
     </w:p>
     <w:p>
@@ -8719,7 +8719,7 @@
           <w:color w:val="1A1A1A"/>
           <w:sz w:val="22"/>
         </w:rPr>
-        <w:t>Maria del Carmen Mejías Mateo · cumple 29 ago</w:t>
+        <w:t>Marian Olanlly Ortiz Carrasco · cumple 23 oct</w:t>
       </w:r>
     </w:p>
     <w:p>
@@ -8733,7 +8733,7 @@
           <w:color w:val="1A1A1A"/>
           <w:sz w:val="22"/>
         </w:rPr>
-        <w:t>Marian Olanlly Ortiz Carrasco · cumple 23 oct</w:t>
+        <w:t>Merkin Jean</w:t>
       </w:r>
     </w:p>
     <w:p>

</xml_diff>

<commit_message>
Roster: Zahir Valoy entra (titular cocina) por Tommy; Rodolfo fuera
Confirmado contra el formulario vivo (hoja de Drive):
- Zahir Valoy respondió 29-jun (tel 849-460-1030, 19a, ETC 85). Sube de backup
  de cocina a TITULAR (reemplaza a Tommy Nova Nolasco). Sexo M inferido del nombre.
- Tommy Nova Nolasco: fuera del equipo (Regla #6: llenó form ≠ estar en el equipo).
- Rodolfo Telémaco Arrendel: fuera por completo (ya ni backup).
Fuente actualizada: build_data.py (REMOVED_FROM_TEAM/PLACEHOLDERS), form_live_overrides.json
(datos de Zahir), estado.json (conteos_esperados 71→69, backups 18→16; notas).
Además: build_difusion.py y build_claude_design_csv.py agregados a run_all.sh
(no estaban → EQUIPO_ETC88.csv/.vcf y EQUIPO_CLAUDE_DESIGN.csv quedaban stale).
Regenerado todo; verify.py TODO PASS. Roster: 69 total, 48 operativos.

Co-Authored-By: Claude Opus 4.8 <noreply@anthropic.com>
Claude-Session: https://claude.ai/code/session_01MGAmtqoRwx6cYP4Ki2adap
</commit_message>
<xml_diff>
--- a/entrega_diseno/CARPETA_ETC88.docx
+++ b/entrega_diseno/CARPETA_ETC88.docx
@@ -8817,7 +8817,7 @@
           <w:color w:val="1A1A1A"/>
           <w:sz w:val="22"/>
         </w:rPr>
-        <w:t>Tommy Nova Nolasco · cumple 7 sep</w:t>
+        <w:t>Wirna Miguelina Stapleton Pilier · cumple 29 sep</w:t>
       </w:r>
     </w:p>
     <w:p>
@@ -8831,7 +8831,7 @@
           <w:color w:val="1A1A1A"/>
           <w:sz w:val="22"/>
         </w:rPr>
-        <w:t>Wirna Miguelina Stapleton Pilier · cumple 29 sep</w:t>
+        <w:t>Zahir Valoy · cumple 7 jun</w:t>
       </w:r>
     </w:p>
     <w:p>

</xml_diff>

<commit_message>
Roster: 3 asesores de comunidad en blanco (por definir), sin nombre
Por decisión del director (1-jul): las 3 plazas de asesor de comunidad
(antes Leticia González, Marleny, Sandrita) quedan EN BLANCO / por definir.
Los coordinadores ya estaban correctos en la fuente (Camila y Priscilla =
Coord. Guía; Johnnito y Paloma = Coord. Cocina; José Ángel = Coord. Música).
build_data.py + notas de estado.json actualizadas; regenerado; verify.py TODO PASS.

Co-Authored-By: Claude Opus 4.8 <noreply@anthropic.com>
Claude-Session: https://claude.ai/code/session_01MGAmtqoRwx6cYP4Ki2adap
</commit_message>
<xml_diff>
--- a/entrega_diseno/CARPETA_ETC88.docx
+++ b/entrega_diseno/CARPETA_ETC88.docx
@@ -9002,7 +9002,7 @@
           <w:color w:val="1A1A1A"/>
           <w:sz w:val="22"/>
         </w:rPr>
-        <w:t>Leticia González — La Vega</w:t>
+        <w:t>Por definir — La Vega</w:t>
       </w:r>
     </w:p>
     <w:p>
@@ -9016,7 +9016,7 @@
           <w:color w:val="1A1A1A"/>
           <w:sz w:val="22"/>
         </w:rPr>
-        <w:t>Marleny — Santo Domingo</w:t>
+        <w:t>Por definir — Santo Domingo (1)</w:t>
       </w:r>
     </w:p>
     <w:p>
@@ -9030,7 +9030,7 @@
           <w:color w:val="1A1A1A"/>
           <w:sz w:val="22"/>
         </w:rPr>
-        <w:t>Sandrita — Santo Domingo</w:t>
+        <w:t>Por definir — Santo Domingo (2)</w:t>
       </w:r>
     </w:p>
     <w:p>

</xml_diff>